<commit_message>
Modified User Interface Design
</commit_message>
<xml_diff>
--- a/Design Phase/DSD.docx
+++ b/Design Phase/DSD.docx
@@ -20,11 +20,24 @@
     <w:p>
       <w:pPr>
         <w:pStyle w:val="Title"/>
-        <w:spacing w:line="276" w:lineRule="auto"/>
+        <w:keepNext w:val="1"/>
+        <w:keepLines w:val="1"/>
+        <w:pageBreakBefore w:val="0"/>
+        <w:widowControl w:val="1"/>
+        <w:pBdr>
+          <w:top w:space="0" w:sz="0" w:val="nil"/>
+          <w:left w:space="0" w:sz="0" w:val="nil"/>
+          <w:bottom w:space="0" w:sz="0" w:val="nil"/>
+          <w:right w:space="0" w:sz="0" w:val="nil"/>
+          <w:between w:space="0" w:sz="0" w:val="nil"/>
+        </w:pBdr>
+        <w:shd w:fill="auto" w:val="clear"/>
+        <w:spacing w:after="60" w:before="0" w:line="276" w:lineRule="auto"/>
+        <w:ind w:left="0" w:right="0" w:firstLine="0"/>
         <w:jc w:val="center"/>
         <w:rPr/>
       </w:pPr>
-      <w:bookmarkStart w:colFirst="0" w:colLast="0" w:name="_9b9uyze1wy37" w:id="1"/>
+      <w:bookmarkStart w:colFirst="0" w:colLast="0" w:name="_k5apa5u31vj" w:id="1"/>
       <w:bookmarkEnd w:id="1"/>
       <w:r>
         <w:rPr>
@@ -82,12 +95,21 @@
         <w:pStyle w:val="Title"/>
         <w:spacing w:line="276" w:lineRule="auto"/>
         <w:jc w:val="center"/>
-        <w:rPr/>
+        <w:rPr>
+          <w:b w:val="1"/>
+          <w:bCs w:val="1"/>
+          <w:sz w:val="64"/>
+          <w:szCs w:val="64"/>
+        </w:rPr>
       </w:pPr>
       <w:bookmarkStart w:colFirst="0" w:colLast="0" w:name="_a8w92dlre7cd" w:id="5"/>
       <w:bookmarkEnd w:id="5"/>
       <w:r>
         <w:rPr>
+          <w:b w:val="1"/>
+          <w:bCs w:val="1"/>
+          <w:sz w:val="64"/>
+          <w:szCs w:val="64"/>
           <w:rtl w:val="0"/>
         </w:rPr>
         <w:t xml:space="preserve">BlackJack Program</w:t>
@@ -140,6 +162,8 @@
         <w:spacing w:line="276" w:lineRule="auto"/>
         <w:jc w:val="center"/>
         <w:rPr>
+          <w:b w:val="1"/>
+          <w:bCs w:val="1"/>
           <w:color w:val="434343"/>
           <w:sz w:val="30"/>
           <w:szCs w:val="30"/>
@@ -147,6 +171,8 @@
       </w:pPr>
       <w:r>
         <w:rPr>
+          <w:b w:val="1"/>
+          <w:bCs w:val="1"/>
           <w:color w:val="434343"/>
           <w:sz w:val="30"/>
           <w:szCs w:val="30"/>
@@ -163,6 +189,8 @@
       </w:pPr>
       <w:r>
         <w:rPr>
+          <w:b w:val="1"/>
+          <w:bCs w:val="1"/>
           <w:color w:val="434343"/>
           <w:sz w:val="30"/>
           <w:szCs w:val="30"/>
@@ -195,6 +223,8 @@
         <w:spacing w:line="276" w:lineRule="auto"/>
         <w:jc w:val="center"/>
         <w:rPr>
+          <w:i w:val="1"/>
+          <w:iCs w:val="1"/>
           <w:color w:val="000000"/>
         </w:rPr>
       </w:pPr>
@@ -202,6 +232,8 @@
       <w:bookmarkEnd w:id="7"/>
       <w:r>
         <w:rPr>
+          <w:i w:val="1"/>
+          <w:iCs w:val="1"/>
           <w:color w:val="000000"/>
           <w:rtl w:val="0"/>
         </w:rPr>
@@ -214,6 +246,8 @@
         <w:spacing w:line="276" w:lineRule="auto"/>
         <w:jc w:val="center"/>
         <w:rPr>
+          <w:i w:val="1"/>
+          <w:iCs w:val="1"/>
           <w:color w:val="000000"/>
         </w:rPr>
       </w:pPr>
@@ -221,6 +255,8 @@
       <w:bookmarkEnd w:id="8"/>
       <w:r>
         <w:rPr>
+          <w:i w:val="1"/>
+          <w:iCs w:val="1"/>
           <w:color w:val="000000"/>
           <w:rtl w:val="0"/>
         </w:rPr>
@@ -2112,8 +2148,12 @@
             </w:pPr>
             <w:r>
               <w:rPr>
+                <w:rFonts w:ascii="Times New Roman" w:cs="Times New Roman" w:eastAsia="Times New Roman" w:hAnsi="Times New Roman"/>
+                <w:sz w:val="20"/>
+                <w:szCs w:val="20"/>
                 <w:rtl w:val="0"/>
               </w:rPr>
+              <w:t xml:space="preserve">05/01/2026</w:t>
             </w:r>
           </w:p>
         </w:tc>
@@ -2138,8 +2178,12 @@
             </w:pPr>
             <w:r>
               <w:rPr>
+                <w:rFonts w:ascii="Times New Roman" w:cs="Times New Roman" w:eastAsia="Times New Roman" w:hAnsi="Times New Roman"/>
+                <w:sz w:val="20"/>
+                <w:szCs w:val="20"/>
                 <w:rtl w:val="0"/>
               </w:rPr>
+              <w:t xml:space="preserve">5.0</w:t>
             </w:r>
           </w:p>
         </w:tc>
@@ -2164,8 +2208,12 @@
             </w:pPr>
             <w:r>
               <w:rPr>
+                <w:rFonts w:ascii="Times New Roman" w:cs="Times New Roman" w:eastAsia="Times New Roman" w:hAnsi="Times New Roman"/>
+                <w:sz w:val="20"/>
+                <w:szCs w:val="20"/>
                 <w:rtl w:val="0"/>
               </w:rPr>
+              <w:t xml:space="preserve">Modified UI Design</w:t>
             </w:r>
           </w:p>
         </w:tc>
@@ -2191,8 +2239,12 @@
             </w:pPr>
             <w:r>
               <w:rPr>
+                <w:rFonts w:ascii="Times New Roman" w:cs="Times New Roman" w:eastAsia="Times New Roman" w:hAnsi="Times New Roman"/>
+                <w:sz w:val="20"/>
+                <w:szCs w:val="20"/>
                 <w:rtl w:val="0"/>
               </w:rPr>
+              <w:t xml:space="preserve">Nikki Ong</w:t>
             </w:r>
           </w:p>
         </w:tc>
@@ -2942,7 +2994,7 @@
     </w:p>
     <w:sdt>
       <w:sdtPr>
-        <w:id w:val="-1466942806"/>
+        <w:id w:val="-1095316380"/>
         <w:docPartObj>
           <w:docPartGallery w:val="Table of Contents"/>
           <w:docPartUnique w:val="1"/>
@@ -4464,20 +4516,20 @@
           <wp:anchor allowOverlap="1" behindDoc="0" distB="114300" distT="114300" distL="114300" distR="114300" hidden="0" layoutInCell="1" locked="0" relativeHeight="0" simplePos="0">
             <wp:simplePos x="0" y="0"/>
             <wp:positionH relativeFrom="column">
-              <wp:posOffset>2981325</wp:posOffset>
+              <wp:posOffset>3090863</wp:posOffset>
             </wp:positionH>
             <wp:positionV relativeFrom="paragraph">
-              <wp:posOffset>447675</wp:posOffset>
+              <wp:posOffset>266700</wp:posOffset>
             </wp:positionV>
-            <wp:extent cx="3548063" cy="2965958"/>
+            <wp:extent cx="3290888" cy="3290888"/>
             <wp:effectExtent b="0" l="0" r="0" t="0"/>
             <wp:wrapSquare wrapText="bothSides" distB="114300" distT="114300" distL="114300" distR="114300"/>
-            <wp:docPr id="5" name="image10.png"/>
+            <wp:docPr id="7" name="image17.jpg"/>
             <a:graphic>
               <a:graphicData uri="http://schemas.openxmlformats.org/drawingml/2006/picture">
                 <pic:pic>
                   <pic:nvPicPr>
-                    <pic:cNvPr id="0" name="image10.png"/>
+                    <pic:cNvPr id="0" name="image17.jpg"/>
                     <pic:cNvPicPr preferRelativeResize="0"/>
                   </pic:nvPicPr>
                   <pic:blipFill>
@@ -4490,7 +4542,7 @@
                   <pic:spPr>
                     <a:xfrm>
                       <a:off x="0" y="0"/>
-                      <a:ext cx="3548063" cy="2965958"/>
+                      <a:ext cx="3290888" cy="3290888"/>
                     </a:xfrm>
                     <a:prstGeom prst="rect"/>
                     <a:ln/>
@@ -4544,13 +4596,21 @@
           <w:iCs w:val="1"/>
           <w:rtl w:val="0"/>
         </w:rPr>
+        <w:t xml:space="preserve">J</w:t>
+      </w:r>
+      <w:r>
+        <w:rPr>
+          <w:i w:val="1"/>
+          <w:iCs w:val="1"/>
+          <w:rtl w:val="0"/>
+        </w:rPr>
         <w:t xml:space="preserve">Labels</w:t>
       </w:r>
       <w:r>
         <w:rPr>
           <w:rtl w:val="0"/>
         </w:rPr>
-        <w:t xml:space="preserve">: Username, Password</w:t>
+        <w:t xml:space="preserve">: Username, Password, IfAccount</w:t>
       </w:r>
     </w:p>
     <w:p>
@@ -4571,7 +4631,7 @@
           <w:iCs w:val="1"/>
           <w:rtl w:val="0"/>
         </w:rPr>
-        <w:t xml:space="preserve">Textfields</w:t>
+        <w:t xml:space="preserve">JTextfields</w:t>
       </w:r>
       <w:r>
         <w:rPr>
@@ -4598,7 +4658,7 @@
           <w:iCs w:val="1"/>
           <w:rtl w:val="0"/>
         </w:rPr>
-        <w:t xml:space="preserve">Buttons</w:t>
+        <w:t xml:space="preserve">JButtons</w:t>
       </w:r>
       <w:r>
         <w:rPr>
@@ -4728,26 +4788,139 @@
         <w:rPr>
           <w:rtl w:val="0"/>
         </w:rPr>
+      </w:r>
+    </w:p>
+    <w:p>
+      <w:pPr>
+        <w:spacing w:line="360" w:lineRule="auto"/>
+        <w:ind w:left="0" w:firstLine="0"/>
+        <w:rPr>
+          <w:b w:val="1"/>
+          <w:bCs w:val="1"/>
+          <w:sz w:val="28"/>
+          <w:szCs w:val="28"/>
+          <w:u w:val="single"/>
+        </w:rPr>
+      </w:pPr>
+      <w:r>
+        <w:rPr>
+          <w:b w:val="1"/>
+          <w:bCs w:val="1"/>
+          <w:sz w:val="28"/>
+          <w:szCs w:val="28"/>
+          <w:u w:val="single"/>
+          <w:rtl w:val="0"/>
+        </w:rPr>
+        <w:t xml:space="preserve">Sign Up Window</w:t>
+      </w:r>
+    </w:p>
+    <w:p>
+      <w:pPr>
+        <w:numPr>
+          <w:ilvl w:val="0"/>
+          <w:numId w:val="34"/>
+        </w:numPr>
+        <w:spacing w:line="360" w:lineRule="auto"/>
+        <w:ind w:left="720" w:hanging="360"/>
+        <w:rPr>
+          <w:u w:val="none"/>
+        </w:rPr>
+      </w:pPr>
+      <w:r>
+        <w:rPr>
+          <w:i w:val="1"/>
+          <w:iCs w:val="1"/>
+          <w:rtl w:val="0"/>
+        </w:rPr>
+        <w:t xml:space="preserve">J</w:t>
+      </w:r>
+      <w:r>
+        <w:rPr>
+          <w:i w:val="1"/>
+          <w:iCs w:val="1"/>
+          <w:rtl w:val="0"/>
+        </w:rPr>
+        <w:t xml:space="preserve">Labels</w:t>
+      </w:r>
+      <w:r>
+        <w:rPr>
+          <w:rtl w:val="0"/>
+        </w:rPr>
+        <w:t xml:space="preserve">: Username, Role, Password, Confirm Password,If have account</w:t>
+      </w:r>
+    </w:p>
+    <w:p>
+      <w:pPr>
+        <w:numPr>
+          <w:ilvl w:val="0"/>
+          <w:numId w:val="34"/>
+        </w:numPr>
+        <w:spacing w:line="360" w:lineRule="auto"/>
+        <w:ind w:left="720" w:hanging="360"/>
+        <w:rPr>
+          <w:u w:val="none"/>
+        </w:rPr>
+      </w:pPr>
+      <w:r>
+        <w:rPr>
+          <w:i w:val="1"/>
+          <w:iCs w:val="1"/>
+          <w:rtl w:val="0"/>
+        </w:rPr>
+        <w:t xml:space="preserve">JTextfields</w:t>
+      </w:r>
+      <w:r>
+        <w:rPr>
+          <w:rtl w:val="0"/>
+        </w:rPr>
+        <w:t xml:space="preserve">: Username, Password, Confirm Password</w:t>
+      </w:r>
+    </w:p>
+    <w:p>
+      <w:pPr>
+        <w:numPr>
+          <w:ilvl w:val="0"/>
+          <w:numId w:val="34"/>
+        </w:numPr>
+        <w:spacing w:line="360" w:lineRule="auto"/>
+        <w:ind w:left="720" w:hanging="360"/>
+        <w:rPr>
+          <w:u w:val="none"/>
+        </w:rPr>
+      </w:pPr>
+      <w:r>
+        <w:rPr>
+          <w:i w:val="1"/>
+          <w:iCs w:val="1"/>
+          <w:rtl w:val="0"/>
+        </w:rPr>
+        <w:t xml:space="preserve">JButtons</w:t>
+      </w:r>
+      <w:r>
+        <w:rPr>
+          <w:rtl w:val="0"/>
+        </w:rPr>
+        <w:t xml:space="preserve">: Sign Up, Login</w:t>
       </w:r>
       <w:r>
         <w:drawing>
           <wp:anchor allowOverlap="1" behindDoc="0" distB="114300" distT="114300" distL="114300" distR="114300" hidden="0" layoutInCell="1" locked="0" relativeHeight="0" simplePos="0">
             <wp:simplePos x="0" y="0"/>
             <wp:positionH relativeFrom="column">
-              <wp:posOffset>2943225</wp:posOffset>
+              <wp:posOffset>3095625</wp:posOffset>
             </wp:positionH>
             <wp:positionV relativeFrom="paragraph">
-              <wp:posOffset>190500</wp:posOffset>
+              <wp:posOffset>309563</wp:posOffset>
             </wp:positionV>
-            <wp:extent cx="3586494" cy="2999963"/>
+            <wp:extent cx="3295650" cy="3322887"/>
             <wp:effectExtent b="0" l="0" r="0" t="0"/>
             <wp:wrapSquare wrapText="bothSides" distB="114300" distT="114300" distL="114300" distR="114300"/>
-            <wp:docPr id="2" name="image16.png"/>
+            <wp:docPr id="24" name="image16.jpg"/>
             <a:graphic>
               <a:graphicData uri="http://schemas.openxmlformats.org/drawingml/2006/picture">
                 <pic:pic>
                   <pic:nvPicPr>
-                    <pic:cNvPr id="0" name="image16.png"/>
+                    <pic:cNvPr id="0" name="image16.jpg"/>
                     <pic:cNvPicPr preferRelativeResize="0"/>
                   </pic:nvPicPr>
                   <pic:blipFill>
@@ -4760,7 +4933,7 @@
                   <pic:spPr>
                     <a:xfrm>
                       <a:off x="0" y="0"/>
-                      <a:ext cx="3586494" cy="2999963"/>
+                      <a:ext cx="3295650" cy="3322887"/>
                     </a:xfrm>
                     <a:prstGeom prst="rect"/>
                     <a:ln/>
@@ -4771,306 +4944,25 @@
           </wp:anchor>
         </w:drawing>
       </w:r>
-    </w:p>
-    <w:p>
-      <w:pPr>
-        <w:spacing w:line="360" w:lineRule="auto"/>
-        <w:ind w:left="0" w:firstLine="0"/>
-        <w:rPr>
-          <w:b w:val="1"/>
-          <w:bCs w:val="1"/>
-          <w:sz w:val="28"/>
-          <w:szCs w:val="28"/>
-          <w:u w:val="single"/>
-        </w:rPr>
-      </w:pPr>
-      <w:r>
-        <w:rPr>
-          <w:b w:val="1"/>
-          <w:bCs w:val="1"/>
-          <w:sz w:val="28"/>
-          <w:szCs w:val="28"/>
-          <w:u w:val="single"/>
-          <w:rtl w:val="0"/>
-        </w:rPr>
-        <w:t xml:space="preserve">Sign Up Window</w:t>
-      </w:r>
-    </w:p>
-    <w:p>
-      <w:pPr>
-        <w:numPr>
-          <w:ilvl w:val="0"/>
-          <w:numId w:val="34"/>
-        </w:numPr>
-        <w:spacing w:line="360" w:lineRule="auto"/>
-        <w:ind w:left="720" w:hanging="360"/>
-        <w:rPr>
-          <w:u w:val="none"/>
-        </w:rPr>
-      </w:pPr>
-      <w:r>
-        <w:rPr>
-          <w:i w:val="1"/>
-          <w:iCs w:val="1"/>
-          <w:rtl w:val="0"/>
-        </w:rPr>
-        <w:t xml:space="preserve">Labels</w:t>
-      </w:r>
-      <w:r>
-        <w:rPr>
-          <w:rtl w:val="0"/>
-        </w:rPr>
-        <w:t xml:space="preserve">: Username, New Password, Confirm Password, Info for password requirements</w:t>
-      </w:r>
-    </w:p>
-    <w:p>
-      <w:pPr>
-        <w:numPr>
-          <w:ilvl w:val="0"/>
-          <w:numId w:val="34"/>
-        </w:numPr>
-        <w:spacing w:line="360" w:lineRule="auto"/>
-        <w:ind w:left="720" w:hanging="360"/>
-        <w:rPr>
-          <w:u w:val="none"/>
-        </w:rPr>
-      </w:pPr>
-      <w:r>
-        <w:rPr>
-          <w:i w:val="1"/>
-          <w:iCs w:val="1"/>
-          <w:rtl w:val="0"/>
-        </w:rPr>
-        <w:t xml:space="preserve">Textfields</w:t>
-      </w:r>
-      <w:r>
-        <w:rPr>
-          <w:rtl w:val="0"/>
-        </w:rPr>
-        <w:t xml:space="preserve">: Username, New Password, Confirm Password</w:t>
-      </w:r>
-    </w:p>
-    <w:p>
-      <w:pPr>
-        <w:numPr>
-          <w:ilvl w:val="0"/>
-          <w:numId w:val="34"/>
-        </w:numPr>
-        <w:spacing w:line="360" w:lineRule="auto"/>
-        <w:ind w:left="720" w:hanging="360"/>
-        <w:rPr>
-          <w:u w:val="none"/>
-        </w:rPr>
-      </w:pPr>
-      <w:r>
-        <w:rPr>
-          <w:i w:val="1"/>
-          <w:iCs w:val="1"/>
-          <w:rtl w:val="0"/>
-        </w:rPr>
-        <w:t xml:space="preserve">Buttons</w:t>
-      </w:r>
-      <w:r>
-        <w:rPr>
-          <w:rtl w:val="0"/>
-        </w:rPr>
-        <w:t xml:space="preserve">: Sign Up</w:t>
-      </w:r>
-    </w:p>
-    <w:p>
-      <w:pPr>
-        <w:ind w:firstLine="720"/>
-        <w:rPr/>
-      </w:pPr>
-      <w:r>
-        <w:rPr>
-          <w:rtl w:val="0"/>
-        </w:rPr>
-      </w:r>
-    </w:p>
-    <w:p>
-      <w:pPr>
-        <w:ind w:firstLine="720"/>
-        <w:rPr/>
-      </w:pPr>
-      <w:r>
-        <w:rPr>
-          <w:rtl w:val="0"/>
-        </w:rPr>
-      </w:r>
-    </w:p>
-    <w:p>
-      <w:pPr>
-        <w:ind w:firstLine="720"/>
-        <w:rPr/>
-      </w:pPr>
-      <w:r>
-        <w:rPr>
-          <w:rtl w:val="0"/>
-        </w:rPr>
-      </w:r>
-    </w:p>
-    <w:p>
-      <w:pPr>
-        <w:ind w:firstLine="720"/>
-        <w:rPr/>
-      </w:pPr>
-      <w:r>
-        <w:rPr>
-          <w:rtl w:val="0"/>
-        </w:rPr>
-      </w:r>
-    </w:p>
-    <w:p>
-      <w:pPr>
-        <w:ind w:firstLine="720"/>
-        <w:rPr/>
-      </w:pPr>
-      <w:r>
-        <w:rPr>
-          <w:rtl w:val="0"/>
-        </w:rPr>
-      </w:r>
-    </w:p>
-    <w:p>
-      <w:pPr>
-        <w:ind w:firstLine="720"/>
-        <w:rPr/>
-      </w:pPr>
-      <w:r>
-        <w:rPr>
-          <w:rtl w:val="0"/>
-        </w:rPr>
-      </w:r>
-    </w:p>
-    <w:p>
-      <w:pPr>
-        <w:ind w:firstLine="720"/>
-        <w:rPr/>
-      </w:pPr>
-      <w:r>
-        <w:rPr>
-          <w:rtl w:val="0"/>
-        </w:rPr>
-      </w:r>
-    </w:p>
-    <w:p>
-      <w:pPr>
-        <w:ind w:firstLine="720"/>
-        <w:rPr/>
-      </w:pPr>
-      <w:r>
-        <w:rPr>
-          <w:rtl w:val="0"/>
-        </w:rPr>
-      </w:r>
-    </w:p>
-    <w:p>
-      <w:pPr>
-        <w:ind w:firstLine="720"/>
-        <w:rPr/>
-      </w:pPr>
-      <w:r>
-        <w:rPr>
-          <w:rtl w:val="0"/>
-        </w:rPr>
-      </w:r>
-    </w:p>
-    <w:p>
-      <w:pPr>
-        <w:ind w:firstLine="720"/>
-        <w:rPr/>
-      </w:pPr>
-      <w:r>
-        <w:rPr>
-          <w:rtl w:val="0"/>
-        </w:rPr>
-      </w:r>
-    </w:p>
-    <w:p>
-      <w:pPr>
-        <w:ind w:firstLine="720"/>
-        <w:rPr/>
-      </w:pPr>
-      <w:r>
-        <w:rPr>
-          <w:rtl w:val="0"/>
-        </w:rPr>
-      </w:r>
-    </w:p>
-    <w:p>
-      <w:pPr>
-        <w:ind w:left="0" w:firstLine="0"/>
-        <w:rPr/>
-      </w:pPr>
-      <w:r>
-        <w:rPr>
-          <w:rtl w:val="0"/>
-        </w:rPr>
-      </w:r>
-    </w:p>
-    <w:p>
-      <w:pPr>
-        <w:ind w:left="0" w:firstLine="0"/>
-        <w:rPr/>
-      </w:pPr>
-      <w:r>
-        <w:rPr>
-          <w:rtl w:val="0"/>
-        </w:rPr>
-      </w:r>
-    </w:p>
-    <w:p>
-      <w:pPr>
-        <w:ind w:left="0" w:firstLine="0"/>
-        <w:rPr/>
-      </w:pPr>
-      <w:r>
-        <w:rPr>
-          <w:rtl w:val="0"/>
-        </w:rPr>
-      </w:r>
-    </w:p>
-    <w:p>
-      <w:pPr>
-        <w:ind w:firstLine="720"/>
-        <w:rPr/>
-      </w:pPr>
-      <w:r>
-        <w:rPr>
-          <w:rtl w:val="0"/>
-        </w:rPr>
-      </w:r>
-    </w:p>
-    <w:p>
-      <w:pPr>
-        <w:ind w:firstLine="720"/>
-        <w:rPr/>
-      </w:pPr>
-      <w:r>
-        <w:rPr>
-          <w:rtl w:val="0"/>
-        </w:rPr>
-      </w:r>
       <w:r>
         <w:drawing>
           <wp:anchor allowOverlap="1" behindDoc="0" distB="114300" distT="114300" distL="114300" distR="114300" hidden="0" layoutInCell="1" locked="0" relativeHeight="0" simplePos="0">
             <wp:simplePos x="0" y="0"/>
             <wp:positionH relativeFrom="column">
-              <wp:posOffset>2524125</wp:posOffset>
+              <wp:posOffset>-333374</wp:posOffset>
             </wp:positionH>
             <wp:positionV relativeFrom="paragraph">
-              <wp:posOffset>289513</wp:posOffset>
+              <wp:posOffset>323850</wp:posOffset>
             </wp:positionV>
-            <wp:extent cx="4014415" cy="3247262"/>
+            <wp:extent cx="3295650" cy="3295650"/>
             <wp:effectExtent b="0" l="0" r="0" t="0"/>
             <wp:wrapSquare wrapText="bothSides" distB="114300" distT="114300" distL="114300" distR="114300"/>
-            <wp:docPr id="14" name="image5.png"/>
+            <wp:docPr id="3" name="image19.jpg"/>
             <a:graphic>
               <a:graphicData uri="http://schemas.openxmlformats.org/drawingml/2006/picture">
                 <pic:pic>
                   <pic:nvPicPr>
-                    <pic:cNvPr id="0" name="image5.png"/>
+                    <pic:cNvPr id="0" name="image19.jpg"/>
                     <pic:cNvPicPr preferRelativeResize="0"/>
                   </pic:nvPicPr>
                   <pic:blipFill>
@@ -5083,7 +4975,7 @@
                   <pic:spPr>
                     <a:xfrm>
                       <a:off x="0" y="0"/>
-                      <a:ext cx="4014415" cy="3247262"/>
+                      <a:ext cx="3295650" cy="3295650"/>
                     </a:xfrm>
                     <a:prstGeom prst="rect"/>
                     <a:ln/>
@@ -5116,7 +5008,7 @@
           <w:u w:val="single"/>
           <w:rtl w:val="0"/>
         </w:rPr>
-        <w:t xml:space="preserve">Game Tables Window</w:t>
+        <w:t xml:space="preserve">Lobby Windows</w:t>
       </w:r>
     </w:p>
     <w:p>
@@ -5137,13 +5029,21 @@
           <w:iCs w:val="1"/>
           <w:rtl w:val="0"/>
         </w:rPr>
+        <w:t xml:space="preserve">J</w:t>
+      </w:r>
+      <w:r>
+        <w:rPr>
+          <w:i w:val="1"/>
+          <w:iCs w:val="1"/>
+          <w:rtl w:val="0"/>
+        </w:rPr>
         <w:t xml:space="preserve">Labels</w:t>
       </w:r>
       <w:r>
         <w:rPr>
           <w:rtl w:val="0"/>
         </w:rPr>
-        <w:t xml:space="preserve">: How To Play Info, Hello User, Capacity of each table (#/6, if max reached says Full!), User’s balance</w:t>
+        <w:t xml:space="preserve">: How To Play, Join a Game!</w:t>
       </w:r>
     </w:p>
     <w:p>
@@ -5164,117 +5064,19 @@
           <w:iCs w:val="1"/>
           <w:rtl w:val="0"/>
         </w:rPr>
-        <w:t xml:space="preserve">Buttons</w:t>
-      </w:r>
-      <w:r>
-        <w:rPr>
-          <w:rtl w:val="0"/>
-        </w:rPr>
-        <w:t xml:space="preserve">: Update Profile, Log Out, View Full Game Rules</w:t>
-      </w:r>
-    </w:p>
-    <w:p>
-      <w:pPr>
-        <w:ind w:firstLine="720"/>
-        <w:rPr/>
-      </w:pPr>
-      <w:r>
-        <w:rPr>
-          <w:rtl w:val="0"/>
-        </w:rPr>
-      </w:r>
-    </w:p>
-    <w:p>
-      <w:pPr>
-        <w:ind w:firstLine="720"/>
-        <w:rPr/>
-      </w:pPr>
-      <w:r>
-        <w:rPr>
-          <w:rtl w:val="0"/>
-        </w:rPr>
-      </w:r>
-    </w:p>
-    <w:p>
-      <w:pPr>
-        <w:ind w:firstLine="720"/>
-        <w:rPr/>
-      </w:pPr>
-      <w:r>
-        <w:rPr>
-          <w:rtl w:val="0"/>
-        </w:rPr>
-      </w:r>
-    </w:p>
-    <w:p>
-      <w:pPr>
-        <w:ind w:firstLine="720"/>
-        <w:rPr/>
-      </w:pPr>
-      <w:r>
-        <w:rPr>
-          <w:rtl w:val="0"/>
-        </w:rPr>
-      </w:r>
-    </w:p>
-    <w:p>
-      <w:pPr>
-        <w:ind w:firstLine="720"/>
-        <w:rPr/>
-      </w:pPr>
-      <w:r>
-        <w:rPr>
-          <w:rtl w:val="0"/>
-        </w:rPr>
-      </w:r>
-    </w:p>
-    <w:p>
-      <w:pPr>
-        <w:ind w:firstLine="720"/>
-        <w:rPr/>
-      </w:pPr>
-      <w:r>
-        <w:rPr>
-          <w:rtl w:val="0"/>
-        </w:rPr>
-      </w:r>
-    </w:p>
-    <w:p>
-      <w:pPr>
-        <w:ind w:firstLine="720"/>
-        <w:rPr/>
-      </w:pPr>
-      <w:r>
-        <w:rPr>
-          <w:rtl w:val="0"/>
-        </w:rPr>
-      </w:r>
-    </w:p>
-    <w:p>
-      <w:pPr>
-        <w:ind w:firstLine="720"/>
-        <w:rPr/>
-      </w:pPr>
-      <w:r>
-        <w:rPr>
-          <w:rtl w:val="0"/>
-        </w:rPr>
-      </w:r>
-    </w:p>
-    <w:p>
-      <w:pPr>
-        <w:ind w:firstLine="720"/>
-        <w:rPr/>
-      </w:pPr>
-      <w:r>
-        <w:rPr>
-          <w:rtl w:val="0"/>
-        </w:rPr>
-      </w:r>
-    </w:p>
-    <w:p>
-      <w:pPr>
-        <w:ind w:left="0" w:firstLine="0"/>
+        <w:t xml:space="preserve">JButtons</w:t>
+      </w:r>
+      <w:r>
+        <w:rPr>
+          <w:rtl w:val="0"/>
+        </w:rPr>
+        <w:t xml:space="preserve">: Account, Logout, Join Table, Deposit, Cash out, Close</w:t>
+      </w:r>
+    </w:p>
+    <w:p>
+      <w:pPr>
+        <w:spacing w:line="360" w:lineRule="auto"/>
+        <w:ind w:left="720" w:firstLine="0"/>
         <w:rPr/>
       </w:pPr>
       <w:r>
@@ -5287,20 +5089,20 @@
           <wp:anchor allowOverlap="1" behindDoc="0" distB="114300" distT="114300" distL="114300" distR="114300" hidden="0" layoutInCell="1" locked="0" relativeHeight="0" simplePos="0">
             <wp:simplePos x="0" y="0"/>
             <wp:positionH relativeFrom="column">
-              <wp:posOffset>3381375</wp:posOffset>
+              <wp:posOffset>3038475</wp:posOffset>
             </wp:positionH>
             <wp:positionV relativeFrom="paragraph">
-              <wp:posOffset>180975</wp:posOffset>
+              <wp:posOffset>190500</wp:posOffset>
             </wp:positionV>
-            <wp:extent cx="3148013" cy="4031839"/>
+            <wp:extent cx="3429000" cy="2767760"/>
             <wp:effectExtent b="0" l="0" r="0" t="0"/>
             <wp:wrapSquare wrapText="bothSides" distB="114300" distT="114300" distL="114300" distR="114300"/>
-            <wp:docPr id="4" name="image2.png"/>
+            <wp:docPr id="5" name="image4.jpg"/>
             <a:graphic>
               <a:graphicData uri="http://schemas.openxmlformats.org/drawingml/2006/picture">
                 <pic:pic>
                   <pic:nvPicPr>
-                    <pic:cNvPr id="0" name="image2.png"/>
+                    <pic:cNvPr id="0" name="image4.jpg"/>
                     <pic:cNvPicPr preferRelativeResize="0"/>
                   </pic:nvPicPr>
                   <pic:blipFill>
@@ -5313,7 +5115,7 @@
                   <pic:spPr>
                     <a:xfrm>
                       <a:off x="0" y="0"/>
-                      <a:ext cx="3148013" cy="4031839"/>
+                      <a:ext cx="3429000" cy="2767760"/>
                     </a:xfrm>
                     <a:prstGeom prst="rect"/>
                     <a:ln/>
@@ -5324,6 +5126,48 @@
           </wp:anchor>
         </w:drawing>
       </w:r>
+      <w:r>
+        <w:drawing>
+          <wp:anchor allowOverlap="1" behindDoc="0" distB="114300" distT="114300" distL="114300" distR="114300" hidden="0" layoutInCell="1" locked="0" relativeHeight="0" simplePos="0">
+            <wp:simplePos x="0" y="0"/>
+            <wp:positionH relativeFrom="column">
+              <wp:posOffset>-571499</wp:posOffset>
+            </wp:positionH>
+            <wp:positionV relativeFrom="paragraph">
+              <wp:posOffset>193337</wp:posOffset>
+            </wp:positionV>
+            <wp:extent cx="3429000" cy="2773831"/>
+            <wp:effectExtent b="0" l="0" r="0" t="0"/>
+            <wp:wrapSquare wrapText="bothSides" distB="114300" distT="114300" distL="114300" distR="114300"/>
+            <wp:docPr id="15" name="image6.jpg"/>
+            <a:graphic>
+              <a:graphicData uri="http://schemas.openxmlformats.org/drawingml/2006/picture">
+                <pic:pic>
+                  <pic:nvPicPr>
+                    <pic:cNvPr id="0" name="image6.jpg"/>
+                    <pic:cNvPicPr preferRelativeResize="0"/>
+                  </pic:nvPicPr>
+                  <pic:blipFill>
+                    <a:blip r:embed="rId10"/>
+                    <a:srcRect b="0" l="0" r="0" t="0"/>
+                    <a:stretch>
+                      <a:fillRect/>
+                    </a:stretch>
+                  </pic:blipFill>
+                  <pic:spPr>
+                    <a:xfrm>
+                      <a:off x="0" y="0"/>
+                      <a:ext cx="3429000" cy="2773831"/>
+                    </a:xfrm>
+                    <a:prstGeom prst="rect"/>
+                    <a:ln/>
+                  </pic:spPr>
+                </pic:pic>
+              </a:graphicData>
+            </a:graphic>
+          </wp:anchor>
+        </w:drawing>
+      </w:r>
     </w:p>
     <w:p>
       <w:pPr>
@@ -5367,13 +5211,21 @@
           <w:iCs w:val="1"/>
           <w:rtl w:val="0"/>
         </w:rPr>
+        <w:t xml:space="preserve">J</w:t>
+      </w:r>
+      <w:r>
+        <w:rPr>
+          <w:i w:val="1"/>
+          <w:iCs w:val="1"/>
+          <w:rtl w:val="0"/>
+        </w:rPr>
         <w:t xml:space="preserve">Labels</w:t>
       </w:r>
       <w:r>
         <w:rPr>
           <w:rtl w:val="0"/>
         </w:rPr>
-        <w:t xml:space="preserve">: Dollar Amount in Pot, User Balance</w:t>
+        <w:t xml:space="preserve">: Score, Bet, Player #</w:t>
       </w:r>
     </w:p>
     <w:p>
@@ -5402,6 +5254,48 @@
         </w:rPr>
         <w:t xml:space="preserve">: Hit, Stand, Fold, Leave Table</w:t>
       </w:r>
+      <w:r>
+        <w:drawing>
+          <wp:anchor allowOverlap="1" behindDoc="0" distB="114300" distT="114300" distL="114300" distR="114300" hidden="0" layoutInCell="1" locked="0" relativeHeight="0" simplePos="0">
+            <wp:simplePos x="0" y="0"/>
+            <wp:positionH relativeFrom="column">
+              <wp:posOffset>3124200</wp:posOffset>
+            </wp:positionH>
+            <wp:positionV relativeFrom="paragraph">
+              <wp:posOffset>336212</wp:posOffset>
+            </wp:positionV>
+            <wp:extent cx="3481388" cy="2811890"/>
+            <wp:effectExtent b="0" l="0" r="0" t="0"/>
+            <wp:wrapSquare wrapText="bothSides" distB="114300" distT="114300" distL="114300" distR="114300"/>
+            <wp:docPr id="14" name="image5.jpg"/>
+            <a:graphic>
+              <a:graphicData uri="http://schemas.openxmlformats.org/drawingml/2006/picture">
+                <pic:pic>
+                  <pic:nvPicPr>
+                    <pic:cNvPr id="0" name="image5.jpg"/>
+                    <pic:cNvPicPr preferRelativeResize="0"/>
+                  </pic:nvPicPr>
+                  <pic:blipFill>
+                    <a:blip r:embed="rId11"/>
+                    <a:srcRect b="0" l="0" r="0" t="0"/>
+                    <a:stretch>
+                      <a:fillRect/>
+                    </a:stretch>
+                  </pic:blipFill>
+                  <pic:spPr>
+                    <a:xfrm>
+                      <a:off x="0" y="0"/>
+                      <a:ext cx="3481388" cy="2811890"/>
+                    </a:xfrm>
+                    <a:prstGeom prst="rect"/>
+                    <a:ln/>
+                  </pic:spPr>
+                </pic:pic>
+              </a:graphicData>
+            </a:graphic>
+          </wp:anchor>
+        </w:drawing>
+      </w:r>
     </w:p>
     <w:p>
       <w:pPr>
@@ -5413,6 +5307,48 @@
         <w:rPr>
           <w:rtl w:val="0"/>
         </w:rPr>
+      </w:r>
+      <w:r>
+        <w:drawing>
+          <wp:anchor allowOverlap="1" behindDoc="0" distB="114300" distT="114300" distL="114300" distR="114300" hidden="0" layoutInCell="1" locked="0" relativeHeight="0" simplePos="0">
+            <wp:simplePos x="0" y="0"/>
+            <wp:positionH relativeFrom="column">
+              <wp:posOffset>-723899</wp:posOffset>
+            </wp:positionH>
+            <wp:positionV relativeFrom="paragraph">
+              <wp:posOffset>118425</wp:posOffset>
+            </wp:positionV>
+            <wp:extent cx="3426055" cy="2771640"/>
+            <wp:effectExtent b="0" l="0" r="0" t="0"/>
+            <wp:wrapSquare wrapText="bothSides" distB="114300" distT="114300" distL="114300" distR="114300"/>
+            <wp:docPr id="11" name="image3.jpg"/>
+            <a:graphic>
+              <a:graphicData uri="http://schemas.openxmlformats.org/drawingml/2006/picture">
+                <pic:pic>
+                  <pic:nvPicPr>
+                    <pic:cNvPr id="0" name="image3.jpg"/>
+                    <pic:cNvPicPr preferRelativeResize="0"/>
+                  </pic:nvPicPr>
+                  <pic:blipFill>
+                    <a:blip r:embed="rId12"/>
+                    <a:srcRect b="0" l="0" r="0" t="0"/>
+                    <a:stretch>
+                      <a:fillRect/>
+                    </a:stretch>
+                  </pic:blipFill>
+                  <pic:spPr>
+                    <a:xfrm>
+                      <a:off x="0" y="0"/>
+                      <a:ext cx="3426055" cy="2771640"/>
+                    </a:xfrm>
+                    <a:prstGeom prst="rect"/>
+                    <a:ln/>
+                  </pic:spPr>
+                </pic:pic>
+              </a:graphicData>
+            </a:graphic>
+          </wp:anchor>
+        </w:drawing>
       </w:r>
     </w:p>
     <w:p>
@@ -14032,7 +13968,7 @@
           <wp:inline distB="114300" distT="114300" distL="114300" distR="114300">
             <wp:extent cx="5943600" cy="4241800"/>
             <wp:effectExtent b="0" l="0" r="0" t="0"/>
-            <wp:docPr id="20" name="image14.png"/>
+            <wp:docPr id="22" name="image14.png"/>
             <a:graphic>
               <a:graphicData uri="http://schemas.openxmlformats.org/drawingml/2006/picture">
                 <pic:pic>
@@ -14041,7 +13977,7 @@
                     <pic:cNvPicPr preferRelativeResize="0"/>
                   </pic:nvPicPr>
                   <pic:blipFill>
-                    <a:blip r:embed="rId10"/>
+                    <a:blip r:embed="rId13"/>
                     <a:srcRect b="0" l="0" r="0" t="0"/>
                     <a:stretch>
                       <a:fillRect/>
@@ -14121,16 +14057,16 @@
           <wp:inline distB="114300" distT="114300" distL="114300" distR="114300">
             <wp:extent cx="6786563" cy="5709848"/>
             <wp:effectExtent b="0" l="0" r="0" t="0"/>
-            <wp:docPr id="10" name="image13.png"/>
+            <wp:docPr id="10" name="image7.png"/>
             <a:graphic>
               <a:graphicData uri="http://schemas.openxmlformats.org/drawingml/2006/picture">
                 <pic:pic>
                   <pic:nvPicPr>
-                    <pic:cNvPr id="0" name="image13.png"/>
+                    <pic:cNvPr id="0" name="image7.png"/>
                     <pic:cNvPicPr preferRelativeResize="0"/>
                   </pic:nvPicPr>
                   <pic:blipFill>
-                    <a:blip r:embed="rId11"/>
+                    <a:blip r:embed="rId14"/>
                     <a:srcRect b="0" l="0" r="0" t="0"/>
                     <a:stretch>
                       <a:fillRect/>
@@ -14300,18 +14236,18 @@
         </w:rPr>
         <w:drawing>
           <wp:inline distB="114300" distT="114300" distL="114300" distR="114300">
-            <wp:extent cx="3662363" cy="7365193"/>
+            <wp:extent cx="6224588" cy="7362825"/>
             <wp:effectExtent b="0" l="0" r="0" t="0"/>
-            <wp:docPr id="9" name="image19.png"/>
+            <wp:docPr id="18" name="image21.png"/>
             <a:graphic>
               <a:graphicData uri="http://schemas.openxmlformats.org/drawingml/2006/picture">
                 <pic:pic>
                   <pic:nvPicPr>
-                    <pic:cNvPr id="0" name="image19.png"/>
+                    <pic:cNvPr id="0" name="image21.png"/>
                     <pic:cNvPicPr preferRelativeResize="0"/>
                   </pic:nvPicPr>
                   <pic:blipFill>
-                    <a:blip r:embed="rId12"/>
+                    <a:blip r:embed="rId15"/>
                     <a:srcRect b="0" l="0" r="0" t="0"/>
                     <a:stretch>
                       <a:fillRect/>
@@ -14320,7 +14256,7 @@
                   <pic:spPr>
                     <a:xfrm>
                       <a:off x="0" y="0"/>
-                      <a:ext cx="3662363" cy="7365193"/>
+                      <a:ext cx="6224588" cy="7362825"/>
                     </a:xfrm>
                     <a:prstGeom prst="rect"/>
                     <a:ln/>
@@ -14390,6 +14326,21 @@
       </w:pPr>
       <w:r>
         <w:rPr>
+          <w:rtl w:val="0"/>
+        </w:rPr>
+      </w:r>
+    </w:p>
+    <w:p>
+      <w:pPr>
+        <w:rPr>
+          <w:b w:val="1"/>
+          <w:bCs w:val="1"/>
+          <w:sz w:val="26"/>
+          <w:szCs w:val="26"/>
+        </w:rPr>
+      </w:pPr>
+      <w:r>
+        <w:rPr>
           <w:b w:val="1"/>
           <w:bCs w:val="1"/>
           <w:sz w:val="26"/>
@@ -14397,18 +14348,18 @@
         </w:rPr>
         <w:drawing>
           <wp:inline distB="114300" distT="114300" distL="114300" distR="114300">
-            <wp:extent cx="5943600" cy="4292600"/>
+            <wp:extent cx="6796088" cy="4911916"/>
             <wp:effectExtent b="0" l="0" r="0" t="0"/>
-            <wp:docPr id="11" name="image4.png"/>
+            <wp:docPr id="2" name="image9.png"/>
             <a:graphic>
               <a:graphicData uri="http://schemas.openxmlformats.org/drawingml/2006/picture">
                 <pic:pic>
                   <pic:nvPicPr>
-                    <pic:cNvPr id="0" name="image4.png"/>
+                    <pic:cNvPr id="0" name="image9.png"/>
                     <pic:cNvPicPr preferRelativeResize="0"/>
                   </pic:nvPicPr>
                   <pic:blipFill>
-                    <a:blip r:embed="rId13"/>
+                    <a:blip r:embed="rId16"/>
                     <a:srcRect b="0" l="0" r="0" t="0"/>
                     <a:stretch>
                       <a:fillRect/>
@@ -14417,7 +14368,7 @@
                   <pic:spPr>
                     <a:xfrm>
                       <a:off x="0" y="0"/>
-                      <a:ext cx="5943600" cy="4292600"/>
+                      <a:ext cx="6796088" cy="4911916"/>
                     </a:xfrm>
                     <a:prstGeom prst="rect"/>
                     <a:ln/>
@@ -14660,22 +14611,6 @@
     </w:p>
     <w:p>
       <w:pPr>
-        <w:ind w:left="0" w:firstLine="0"/>
-        <w:rPr>
-          <w:b w:val="1"/>
-          <w:bCs w:val="1"/>
-          <w:sz w:val="26"/>
-          <w:szCs w:val="26"/>
-        </w:rPr>
-      </w:pPr>
-      <w:r>
-        <w:rPr>
-          <w:rtl w:val="0"/>
-        </w:rPr>
-      </w:r>
-    </w:p>
-    <w:p>
-      <w:pPr>
         <w:ind w:left="720" w:firstLine="0"/>
         <w:rPr>
           <w:b w:val="1"/>
@@ -14735,16 +14670,16 @@
           <wp:inline distB="114300" distT="114300" distL="114300" distR="114300">
             <wp:extent cx="6148388" cy="6699139"/>
             <wp:effectExtent b="0" l="0" r="0" t="0"/>
-            <wp:docPr id="16" name="image11.png"/>
+            <wp:docPr id="17" name="image18.png"/>
             <a:graphic>
               <a:graphicData uri="http://schemas.openxmlformats.org/drawingml/2006/picture">
                 <pic:pic>
                   <pic:nvPicPr>
-                    <pic:cNvPr id="0" name="image11.png"/>
+                    <pic:cNvPr id="0" name="image18.png"/>
                     <pic:cNvPicPr preferRelativeResize="0"/>
                   </pic:nvPicPr>
                   <pic:blipFill>
-                    <a:blip r:embed="rId14"/>
+                    <a:blip r:embed="rId17"/>
                     <a:srcRect b="0" l="0" r="0" t="0"/>
                     <a:stretch>
                       <a:fillRect/>
@@ -14865,16 +14800,16 @@
           <wp:inline distB="114300" distT="114300" distL="114300" distR="114300">
             <wp:extent cx="5943600" cy="5321300"/>
             <wp:effectExtent b="0" l="0" r="0" t="0"/>
-            <wp:docPr id="13" name="image8.png"/>
+            <wp:docPr id="13" name="image13.png"/>
             <a:graphic>
               <a:graphicData uri="http://schemas.openxmlformats.org/drawingml/2006/picture">
                 <pic:pic>
                   <pic:nvPicPr>
-                    <pic:cNvPr id="0" name="image8.png"/>
+                    <pic:cNvPr id="0" name="image13.png"/>
                     <pic:cNvPicPr preferRelativeResize="0"/>
                   </pic:nvPicPr>
                   <pic:blipFill>
-                    <a:blip r:embed="rId15"/>
+                    <a:blip r:embed="rId18"/>
                     <a:srcRect b="0" l="0" r="0" t="0"/>
                     <a:stretch>
                       <a:fillRect/>
@@ -15142,16 +15077,16 @@
           <wp:inline distB="114300" distT="114300" distL="114300" distR="114300">
             <wp:extent cx="5943600" cy="5880100"/>
             <wp:effectExtent b="0" l="0" r="0" t="0"/>
-            <wp:docPr id="12" name="image6.png"/>
+            <wp:docPr id="12" name="image12.png"/>
             <a:graphic>
               <a:graphicData uri="http://schemas.openxmlformats.org/drawingml/2006/picture">
                 <pic:pic>
                   <pic:nvPicPr>
-                    <pic:cNvPr id="0" name="image6.png"/>
+                    <pic:cNvPr id="0" name="image12.png"/>
                     <pic:cNvPicPr preferRelativeResize="0"/>
                   </pic:nvPicPr>
                   <pic:blipFill>
-                    <a:blip r:embed="rId16"/>
+                    <a:blip r:embed="rId19"/>
                     <a:srcRect b="0" l="0" r="0" t="0"/>
                     <a:stretch>
                       <a:fillRect/>
@@ -15329,16 +15264,6 @@
         </w:rPr>
         <w:t xml:space="preserve">Use Case ID: 006 – Create New Table</w:t>
       </w:r>
-    </w:p>
-    <w:p>
-      <w:pPr>
-        <w:rPr>
-          <w:b w:val="1"/>
-          <w:bCs w:val="1"/>
-          <w:sz w:val="26"/>
-          <w:szCs w:val="26"/>
-        </w:rPr>
-      </w:pPr>
       <w:r>
         <w:rPr>
           <w:b w:val="1"/>
@@ -15350,16 +15275,16 @@
           <wp:inline distB="114300" distT="114300" distL="114300" distR="114300">
             <wp:extent cx="5100638" cy="7948174"/>
             <wp:effectExtent b="0" l="0" r="0" t="0"/>
-            <wp:docPr id="3" name="image18.png"/>
+            <wp:docPr id="4" name="image22.png"/>
             <a:graphic>
               <a:graphicData uri="http://schemas.openxmlformats.org/drawingml/2006/picture">
                 <pic:pic>
                   <pic:nvPicPr>
-                    <pic:cNvPr id="0" name="image18.png"/>
+                    <pic:cNvPr id="0" name="image22.png"/>
                     <pic:cNvPicPr preferRelativeResize="0"/>
                   </pic:nvPicPr>
                   <pic:blipFill>
-                    <a:blip r:embed="rId17"/>
+                    <a:blip r:embed="rId20"/>
                     <a:srcRect b="0" l="0" r="0" t="0"/>
                     <a:stretch>
                       <a:fillRect/>
@@ -15430,16 +15355,16 @@
           <wp:inline distB="114300" distT="114300" distL="114300" distR="114300">
             <wp:extent cx="6234113" cy="3286896"/>
             <wp:effectExtent b="0" l="0" r="0" t="0"/>
-            <wp:docPr id="18" name="image12.png"/>
+            <wp:docPr id="20" name="image1.png"/>
             <a:graphic>
               <a:graphicData uri="http://schemas.openxmlformats.org/drawingml/2006/picture">
                 <pic:pic>
                   <pic:nvPicPr>
-                    <pic:cNvPr id="0" name="image12.png"/>
+                    <pic:cNvPr id="0" name="image1.png"/>
                     <pic:cNvPicPr preferRelativeResize="0"/>
                   </pic:nvPicPr>
                   <pic:blipFill>
-                    <a:blip r:embed="rId18"/>
+                    <a:blip r:embed="rId21"/>
                     <a:srcRect b="0" l="0" r="0" t="0"/>
                     <a:stretch>
                       <a:fillRect/>
@@ -15510,16 +15435,16 @@
           <wp:inline distB="114300" distT="114300" distL="114300" distR="114300">
             <wp:extent cx="6745553" cy="2733621"/>
             <wp:effectExtent b="0" l="0" r="0" t="0"/>
-            <wp:docPr id="21" name="image17.png"/>
+            <wp:docPr id="23" name="image15.png"/>
             <a:graphic>
               <a:graphicData uri="http://schemas.openxmlformats.org/drawingml/2006/picture">
                 <pic:pic>
                   <pic:nvPicPr>
-                    <pic:cNvPr id="0" name="image17.png"/>
+                    <pic:cNvPr id="0" name="image15.png"/>
                     <pic:cNvPicPr preferRelativeResize="0"/>
                   </pic:nvPicPr>
                   <pic:blipFill>
-                    <a:blip r:embed="rId19"/>
+                    <a:blip r:embed="rId22"/>
                     <a:srcRect b="0" l="0" r="0" t="0"/>
                     <a:stretch>
                       <a:fillRect/>
@@ -15695,16 +15620,16 @@
           <wp:inline distB="114300" distT="114300" distL="114300" distR="114300">
             <wp:extent cx="5705825" cy="3339261"/>
             <wp:effectExtent b="0" l="0" r="0" t="0"/>
-            <wp:docPr id="7" name="image3.png"/>
+            <wp:docPr id="8" name="image8.png"/>
             <a:graphic>
               <a:graphicData uri="http://schemas.openxmlformats.org/drawingml/2006/picture">
                 <pic:pic>
                   <pic:nvPicPr>
-                    <pic:cNvPr id="0" name="image3.png"/>
+                    <pic:cNvPr id="0" name="image8.png"/>
                     <pic:cNvPicPr preferRelativeResize="0"/>
                   </pic:nvPicPr>
                   <pic:blipFill>
-                    <a:blip r:embed="rId20"/>
+                    <a:blip r:embed="rId23"/>
                     <a:srcRect b="0" l="0" r="0" t="0"/>
                     <a:stretch>
                       <a:fillRect/>
@@ -17433,16 +17358,16 @@
               <wp:inline distB="114300" distT="114300" distL="114300" distR="114300">
                 <wp:extent cx="4872299" cy="3833813"/>
                 <wp:effectExtent b="0" l="0" r="0" t="0"/>
-                <wp:docPr id="1" name="image15.png"/>
+                <wp:docPr id="1" name="image20.png"/>
                 <a:graphic>
                   <a:graphicData uri="http://schemas.openxmlformats.org/drawingml/2006/picture">
                     <pic:pic>
                       <pic:nvPicPr>
-                        <pic:cNvPr id="0" name="image15.png"/>
+                        <pic:cNvPr id="0" name="image20.png"/>
                         <pic:cNvPicPr preferRelativeResize="0"/>
                       </pic:nvPicPr>
                       <pic:blipFill>
-                        <a:blip r:embed="rId21"/>
+                        <a:blip r:embed="rId24"/>
                         <a:srcRect/>
                         <a:stretch>
                           <a:fillRect/>
@@ -17560,16 +17485,16 @@
           <wp:inline distB="114300" distT="114300" distL="114300" distR="114300">
             <wp:extent cx="6653213" cy="5493568"/>
             <wp:effectExtent b="0" l="0" r="0" t="0"/>
-            <wp:docPr id="17" name="image9.png"/>
+            <wp:docPr id="19" name="image10.png"/>
             <a:graphic>
               <a:graphicData uri="http://schemas.openxmlformats.org/drawingml/2006/picture">
                 <pic:pic>
                   <pic:nvPicPr>
-                    <pic:cNvPr id="0" name="image9.png"/>
+                    <pic:cNvPr id="0" name="image10.png"/>
                     <pic:cNvPicPr preferRelativeResize="0"/>
                   </pic:nvPicPr>
                   <pic:blipFill>
-                    <a:blip r:embed="rId22"/>
+                    <a:blip r:embed="rId25"/>
                     <a:srcRect b="0" l="0" r="0" t="0"/>
                     <a:stretch>
                       <a:fillRect/>
@@ -17785,16 +17710,16 @@
           <wp:inline distB="114300" distT="114300" distL="114300" distR="114300">
             <wp:extent cx="6481763" cy="5484568"/>
             <wp:effectExtent b="0" l="0" r="0" t="0"/>
-            <wp:docPr id="19" name="image7.png"/>
+            <wp:docPr id="21" name="image11.png"/>
             <a:graphic>
               <a:graphicData uri="http://schemas.openxmlformats.org/drawingml/2006/picture">
                 <pic:pic>
                   <pic:nvPicPr>
-                    <pic:cNvPr id="0" name="image7.png"/>
+                    <pic:cNvPr id="0" name="image11.png"/>
                     <pic:cNvPicPr preferRelativeResize="0"/>
                   </pic:nvPicPr>
                   <pic:blipFill>
-                    <a:blip r:embed="rId23"/>
+                    <a:blip r:embed="rId26"/>
                     <a:srcRect b="0" l="0" r="0" t="0"/>
                     <a:stretch>
                       <a:fillRect/>
@@ -18041,16 +17966,16 @@
           <wp:inline distB="114300" distT="114300" distL="114300" distR="114300">
             <wp:extent cx="6024563" cy="4781927"/>
             <wp:effectExtent b="0" l="0" r="0" t="0"/>
-            <wp:docPr id="6" name="image1.png"/>
+            <wp:docPr id="6" name="image2.png"/>
             <a:graphic>
               <a:graphicData uri="http://schemas.openxmlformats.org/drawingml/2006/picture">
                 <pic:pic>
                   <pic:nvPicPr>
-                    <pic:cNvPr id="0" name="image1.png"/>
+                    <pic:cNvPr id="0" name="image2.png"/>
                     <pic:cNvPicPr preferRelativeResize="0"/>
                   </pic:nvPicPr>
                   <pic:blipFill>
-                    <a:blip r:embed="rId24"/>
+                    <a:blip r:embed="rId27"/>
                     <a:srcRect b="0" l="0" r="0" t="0"/>
                     <a:stretch>
                       <a:fillRect/>
@@ -18306,16 +18231,16 @@
           <wp:inline distB="114300" distT="114300" distL="114300" distR="114300">
             <wp:extent cx="6119813" cy="7797170"/>
             <wp:effectExtent b="0" l="0" r="0" t="0"/>
-            <wp:docPr id="15" name="image21.png"/>
+            <wp:docPr id="16" name="image24.png"/>
             <a:graphic>
               <a:graphicData uri="http://schemas.openxmlformats.org/drawingml/2006/picture">
                 <pic:pic>
                   <pic:nvPicPr>
-                    <pic:cNvPr id="0" name="image21.png"/>
+                    <pic:cNvPr id="0" name="image24.png"/>
                     <pic:cNvPicPr preferRelativeResize="0"/>
                   </pic:nvPicPr>
                   <pic:blipFill>
-                    <a:blip r:embed="rId25"/>
+                    <a:blip r:embed="rId28"/>
                     <a:srcRect b="3957" l="2362" r="2835" t="3856"/>
                     <a:stretch>
                       <a:fillRect/>
@@ -18379,18 +18304,18 @@
         </w:rPr>
         <w:drawing>
           <wp:inline distB="114300" distT="114300" distL="114300" distR="114300">
-            <wp:extent cx="4110038" cy="7880001"/>
+            <wp:extent cx="6329363" cy="7877175"/>
             <wp:effectExtent b="0" l="0" r="0" t="0"/>
-            <wp:docPr id="8" name="image20.png"/>
+            <wp:docPr id="9" name="image23.png"/>
             <a:graphic>
               <a:graphicData uri="http://schemas.openxmlformats.org/drawingml/2006/picture">
                 <pic:pic>
                   <pic:nvPicPr>
-                    <pic:cNvPr id="0" name="image20.png"/>
+                    <pic:cNvPr id="0" name="image23.png"/>
                     <pic:cNvPicPr preferRelativeResize="0"/>
                   </pic:nvPicPr>
                   <pic:blipFill>
-                    <a:blip r:embed="rId26"/>
+                    <a:blip r:embed="rId29"/>
                     <a:srcRect b="3103" l="0" r="0" t="3513"/>
                     <a:stretch>
                       <a:fillRect/>
@@ -18399,7 +18324,7 @@
                   <pic:spPr>
                     <a:xfrm>
                       <a:off x="0" y="0"/>
-                      <a:ext cx="4110038" cy="7880001"/>
+                      <a:ext cx="6329363" cy="7877175"/>
                     </a:xfrm>
                     <a:prstGeom prst="rect"/>
                     <a:ln/>
@@ -18417,8 +18342,8 @@
       </w:r>
     </w:p>
     <w:sectPr>
-      <w:headerReference r:id="rId27" w:type="default"/>
-      <w:footerReference r:id="rId28" w:type="default"/>
+      <w:headerReference r:id="rId30" w:type="default"/>
+      <w:footerReference r:id="rId31" w:type="default"/>
       <w:pgSz w:h="15840" w:w="12240" w:orient="portrait"/>
       <w:pgMar w:bottom="1440" w:top="1440" w:left="1440" w:right="1440" w:header="720" w:footer="720"/>
       <w:pgNumType w:start="1"/>

</xml_diff>

<commit_message>
Revert "Merge branch 'main' into feature/gui"
This reverts commit 0d67eea8788e6c01ffee94df20fa849003f625bf, reversing
changes made to 76af3789ad78c63f75721eb96841d495d7378425.
</commit_message>
<xml_diff>
--- a/Design Phase/DSD.docx
+++ b/Design Phase/DSD.docx
@@ -20,24 +20,11 @@
     <w:p>
       <w:pPr>
         <w:pStyle w:val="Title"/>
-        <w:keepNext w:val="1"/>
-        <w:keepLines w:val="1"/>
-        <w:pageBreakBefore w:val="0"/>
-        <w:widowControl w:val="1"/>
-        <w:pBdr>
-          <w:top w:space="0" w:sz="0" w:val="nil"/>
-          <w:left w:space="0" w:sz="0" w:val="nil"/>
-          <w:bottom w:space="0" w:sz="0" w:val="nil"/>
-          <w:right w:space="0" w:sz="0" w:val="nil"/>
-          <w:between w:space="0" w:sz="0" w:val="nil"/>
-        </w:pBdr>
-        <w:shd w:fill="auto" w:val="clear"/>
-        <w:spacing w:after="60" w:before="0" w:line="276" w:lineRule="auto"/>
-        <w:ind w:left="0" w:right="0" w:firstLine="0"/>
+        <w:spacing w:line="276" w:lineRule="auto"/>
         <w:jc w:val="center"/>
         <w:rPr/>
       </w:pPr>
-      <w:bookmarkStart w:colFirst="0" w:colLast="0" w:name="_k5apa5u31vj" w:id="1"/>
+      <w:bookmarkStart w:colFirst="0" w:colLast="0" w:name="_9b9uyze1wy37" w:id="1"/>
       <w:bookmarkEnd w:id="1"/>
       <w:r>
         <w:rPr>
@@ -95,21 +82,12 @@
         <w:pStyle w:val="Title"/>
         <w:spacing w:line="276" w:lineRule="auto"/>
         <w:jc w:val="center"/>
-        <w:rPr>
-          <w:b w:val="1"/>
-          <w:bCs w:val="1"/>
-          <w:sz w:val="64"/>
-          <w:szCs w:val="64"/>
-        </w:rPr>
+        <w:rPr/>
       </w:pPr>
       <w:bookmarkStart w:colFirst="0" w:colLast="0" w:name="_a8w92dlre7cd" w:id="5"/>
       <w:bookmarkEnd w:id="5"/>
       <w:r>
         <w:rPr>
-          <w:b w:val="1"/>
-          <w:bCs w:val="1"/>
-          <w:sz w:val="64"/>
-          <w:szCs w:val="64"/>
           <w:rtl w:val="0"/>
         </w:rPr>
         <w:t xml:space="preserve">BlackJack Program</w:t>
@@ -162,8 +140,6 @@
         <w:spacing w:line="276" w:lineRule="auto"/>
         <w:jc w:val="center"/>
         <w:rPr>
-          <w:b w:val="1"/>
-          <w:bCs w:val="1"/>
           <w:color w:val="434343"/>
           <w:sz w:val="30"/>
           <w:szCs w:val="30"/>
@@ -171,8 +147,6 @@
       </w:pPr>
       <w:r>
         <w:rPr>
-          <w:b w:val="1"/>
-          <w:bCs w:val="1"/>
           <w:color w:val="434343"/>
           <w:sz w:val="30"/>
           <w:szCs w:val="30"/>
@@ -189,8 +163,6 @@
       </w:pPr>
       <w:r>
         <w:rPr>
-          <w:b w:val="1"/>
-          <w:bCs w:val="1"/>
           <w:color w:val="434343"/>
           <w:sz w:val="30"/>
           <w:szCs w:val="30"/>
@@ -223,8 +195,6 @@
         <w:spacing w:line="276" w:lineRule="auto"/>
         <w:jc w:val="center"/>
         <w:rPr>
-          <w:i w:val="1"/>
-          <w:iCs w:val="1"/>
           <w:color w:val="000000"/>
         </w:rPr>
       </w:pPr>
@@ -232,8 +202,6 @@
       <w:bookmarkEnd w:id="7"/>
       <w:r>
         <w:rPr>
-          <w:i w:val="1"/>
-          <w:iCs w:val="1"/>
           <w:color w:val="000000"/>
           <w:rtl w:val="0"/>
         </w:rPr>
@@ -246,8 +214,6 @@
         <w:spacing w:line="276" w:lineRule="auto"/>
         <w:jc w:val="center"/>
         <w:rPr>
-          <w:i w:val="1"/>
-          <w:iCs w:val="1"/>
           <w:color w:val="000000"/>
         </w:rPr>
       </w:pPr>
@@ -255,8 +221,6 @@
       <w:bookmarkEnd w:id="8"/>
       <w:r>
         <w:rPr>
-          <w:i w:val="1"/>
-          <w:iCs w:val="1"/>
           <w:color w:val="000000"/>
           <w:rtl w:val="0"/>
         </w:rPr>
@@ -2148,12 +2112,8 @@
             </w:pPr>
             <w:r>
               <w:rPr>
-                <w:rFonts w:ascii="Times New Roman" w:cs="Times New Roman" w:eastAsia="Times New Roman" w:hAnsi="Times New Roman"/>
-                <w:sz w:val="20"/>
-                <w:szCs w:val="20"/>
                 <w:rtl w:val="0"/>
               </w:rPr>
-              <w:t xml:space="preserve">05/01/2026</w:t>
             </w:r>
           </w:p>
         </w:tc>
@@ -2178,12 +2138,8 @@
             </w:pPr>
             <w:r>
               <w:rPr>
-                <w:rFonts w:ascii="Times New Roman" w:cs="Times New Roman" w:eastAsia="Times New Roman" w:hAnsi="Times New Roman"/>
-                <w:sz w:val="20"/>
-                <w:szCs w:val="20"/>
                 <w:rtl w:val="0"/>
               </w:rPr>
-              <w:t xml:space="preserve">5.0</w:t>
             </w:r>
           </w:p>
         </w:tc>
@@ -2208,12 +2164,8 @@
             </w:pPr>
             <w:r>
               <w:rPr>
-                <w:rFonts w:ascii="Times New Roman" w:cs="Times New Roman" w:eastAsia="Times New Roman" w:hAnsi="Times New Roman"/>
-                <w:sz w:val="20"/>
-                <w:szCs w:val="20"/>
                 <w:rtl w:val="0"/>
               </w:rPr>
-              <w:t xml:space="preserve">Modified UI Design</w:t>
             </w:r>
           </w:p>
         </w:tc>
@@ -2239,12 +2191,8 @@
             </w:pPr>
             <w:r>
               <w:rPr>
-                <w:rFonts w:ascii="Times New Roman" w:cs="Times New Roman" w:eastAsia="Times New Roman" w:hAnsi="Times New Roman"/>
-                <w:sz w:val="20"/>
-                <w:szCs w:val="20"/>
                 <w:rtl w:val="0"/>
               </w:rPr>
-              <w:t xml:space="preserve">Nikki Ong</w:t>
             </w:r>
           </w:p>
         </w:tc>
@@ -2994,7 +2942,7 @@
     </w:p>
     <w:sdt>
       <w:sdtPr>
-        <w:id w:val="-1095316380"/>
+        <w:id w:val="-1466942806"/>
         <w:docPartObj>
           <w:docPartGallery w:val="Table of Contents"/>
           <w:docPartUnique w:val="1"/>
@@ -4516,20 +4464,20 @@
           <wp:anchor allowOverlap="1" behindDoc="0" distB="114300" distT="114300" distL="114300" distR="114300" hidden="0" layoutInCell="1" locked="0" relativeHeight="0" simplePos="0">
             <wp:simplePos x="0" y="0"/>
             <wp:positionH relativeFrom="column">
-              <wp:posOffset>3090863</wp:posOffset>
+              <wp:posOffset>2981325</wp:posOffset>
             </wp:positionH>
             <wp:positionV relativeFrom="paragraph">
-              <wp:posOffset>266700</wp:posOffset>
+              <wp:posOffset>447675</wp:posOffset>
             </wp:positionV>
-            <wp:extent cx="3290888" cy="3290888"/>
+            <wp:extent cx="3548063" cy="2965958"/>
             <wp:effectExtent b="0" l="0" r="0" t="0"/>
             <wp:wrapSquare wrapText="bothSides" distB="114300" distT="114300" distL="114300" distR="114300"/>
-            <wp:docPr id="7" name="image17.jpg"/>
+            <wp:docPr id="5" name="image10.png"/>
             <a:graphic>
               <a:graphicData uri="http://schemas.openxmlformats.org/drawingml/2006/picture">
                 <pic:pic>
                   <pic:nvPicPr>
-                    <pic:cNvPr id="0" name="image17.jpg"/>
+                    <pic:cNvPr id="0" name="image10.png"/>
                     <pic:cNvPicPr preferRelativeResize="0"/>
                   </pic:nvPicPr>
                   <pic:blipFill>
@@ -4542,7 +4490,7 @@
                   <pic:spPr>
                     <a:xfrm>
                       <a:off x="0" y="0"/>
-                      <a:ext cx="3290888" cy="3290888"/>
+                      <a:ext cx="3548063" cy="2965958"/>
                     </a:xfrm>
                     <a:prstGeom prst="rect"/>
                     <a:ln/>
@@ -4596,21 +4544,13 @@
           <w:iCs w:val="1"/>
           <w:rtl w:val="0"/>
         </w:rPr>
-        <w:t xml:space="preserve">J</w:t>
-      </w:r>
-      <w:r>
-        <w:rPr>
-          <w:i w:val="1"/>
-          <w:iCs w:val="1"/>
-          <w:rtl w:val="0"/>
-        </w:rPr>
         <w:t xml:space="preserve">Labels</w:t>
       </w:r>
       <w:r>
         <w:rPr>
           <w:rtl w:val="0"/>
         </w:rPr>
-        <w:t xml:space="preserve">: Username, Password, IfAccount</w:t>
+        <w:t xml:space="preserve">: Username, Password</w:t>
       </w:r>
     </w:p>
     <w:p>
@@ -4631,7 +4571,7 @@
           <w:iCs w:val="1"/>
           <w:rtl w:val="0"/>
         </w:rPr>
-        <w:t xml:space="preserve">JTextfields</w:t>
+        <w:t xml:space="preserve">Textfields</w:t>
       </w:r>
       <w:r>
         <w:rPr>
@@ -4658,7 +4598,7 @@
           <w:iCs w:val="1"/>
           <w:rtl w:val="0"/>
         </w:rPr>
-        <w:t xml:space="preserve">JButtons</w:t>
+        <w:t xml:space="preserve">Buttons</w:t>
       </w:r>
       <w:r>
         <w:rPr>
@@ -4788,139 +4728,26 @@
         <w:rPr>
           <w:rtl w:val="0"/>
         </w:rPr>
-      </w:r>
-    </w:p>
-    <w:p>
-      <w:pPr>
-        <w:spacing w:line="360" w:lineRule="auto"/>
-        <w:ind w:left="0" w:firstLine="0"/>
-        <w:rPr>
-          <w:b w:val="1"/>
-          <w:bCs w:val="1"/>
-          <w:sz w:val="28"/>
-          <w:szCs w:val="28"/>
-          <w:u w:val="single"/>
-        </w:rPr>
-      </w:pPr>
-      <w:r>
-        <w:rPr>
-          <w:b w:val="1"/>
-          <w:bCs w:val="1"/>
-          <w:sz w:val="28"/>
-          <w:szCs w:val="28"/>
-          <w:u w:val="single"/>
-          <w:rtl w:val="0"/>
-        </w:rPr>
-        <w:t xml:space="preserve">Sign Up Window</w:t>
-      </w:r>
-    </w:p>
-    <w:p>
-      <w:pPr>
-        <w:numPr>
-          <w:ilvl w:val="0"/>
-          <w:numId w:val="34"/>
-        </w:numPr>
-        <w:spacing w:line="360" w:lineRule="auto"/>
-        <w:ind w:left="720" w:hanging="360"/>
-        <w:rPr>
-          <w:u w:val="none"/>
-        </w:rPr>
-      </w:pPr>
-      <w:r>
-        <w:rPr>
-          <w:i w:val="1"/>
-          <w:iCs w:val="1"/>
-          <w:rtl w:val="0"/>
-        </w:rPr>
-        <w:t xml:space="preserve">J</w:t>
-      </w:r>
-      <w:r>
-        <w:rPr>
-          <w:i w:val="1"/>
-          <w:iCs w:val="1"/>
-          <w:rtl w:val="0"/>
-        </w:rPr>
-        <w:t xml:space="preserve">Labels</w:t>
-      </w:r>
-      <w:r>
-        <w:rPr>
-          <w:rtl w:val="0"/>
-        </w:rPr>
-        <w:t xml:space="preserve">: Username, Role, Password, Confirm Password,If have account</w:t>
-      </w:r>
-    </w:p>
-    <w:p>
-      <w:pPr>
-        <w:numPr>
-          <w:ilvl w:val="0"/>
-          <w:numId w:val="34"/>
-        </w:numPr>
-        <w:spacing w:line="360" w:lineRule="auto"/>
-        <w:ind w:left="720" w:hanging="360"/>
-        <w:rPr>
-          <w:u w:val="none"/>
-        </w:rPr>
-      </w:pPr>
-      <w:r>
-        <w:rPr>
-          <w:i w:val="1"/>
-          <w:iCs w:val="1"/>
-          <w:rtl w:val="0"/>
-        </w:rPr>
-        <w:t xml:space="preserve">JTextfields</w:t>
-      </w:r>
-      <w:r>
-        <w:rPr>
-          <w:rtl w:val="0"/>
-        </w:rPr>
-        <w:t xml:space="preserve">: Username, Password, Confirm Password</w:t>
-      </w:r>
-    </w:p>
-    <w:p>
-      <w:pPr>
-        <w:numPr>
-          <w:ilvl w:val="0"/>
-          <w:numId w:val="34"/>
-        </w:numPr>
-        <w:spacing w:line="360" w:lineRule="auto"/>
-        <w:ind w:left="720" w:hanging="360"/>
-        <w:rPr>
-          <w:u w:val="none"/>
-        </w:rPr>
-      </w:pPr>
-      <w:r>
-        <w:rPr>
-          <w:i w:val="1"/>
-          <w:iCs w:val="1"/>
-          <w:rtl w:val="0"/>
-        </w:rPr>
-        <w:t xml:space="preserve">JButtons</w:t>
-      </w:r>
-      <w:r>
-        <w:rPr>
-          <w:rtl w:val="0"/>
-        </w:rPr>
-        <w:t xml:space="preserve">: Sign Up, Login</w:t>
       </w:r>
       <w:r>
         <w:drawing>
           <wp:anchor allowOverlap="1" behindDoc="0" distB="114300" distT="114300" distL="114300" distR="114300" hidden="0" layoutInCell="1" locked="0" relativeHeight="0" simplePos="0">
             <wp:simplePos x="0" y="0"/>
             <wp:positionH relativeFrom="column">
-              <wp:posOffset>3095625</wp:posOffset>
+              <wp:posOffset>2943225</wp:posOffset>
             </wp:positionH>
             <wp:positionV relativeFrom="paragraph">
-              <wp:posOffset>309563</wp:posOffset>
+              <wp:posOffset>190500</wp:posOffset>
             </wp:positionV>
-            <wp:extent cx="3295650" cy="3322887"/>
+            <wp:extent cx="3586494" cy="2999963"/>
             <wp:effectExtent b="0" l="0" r="0" t="0"/>
             <wp:wrapSquare wrapText="bothSides" distB="114300" distT="114300" distL="114300" distR="114300"/>
-            <wp:docPr id="24" name="image16.jpg"/>
+            <wp:docPr id="2" name="image16.png"/>
             <a:graphic>
               <a:graphicData uri="http://schemas.openxmlformats.org/drawingml/2006/picture">
                 <pic:pic>
                   <pic:nvPicPr>
-                    <pic:cNvPr id="0" name="image16.jpg"/>
+                    <pic:cNvPr id="0" name="image16.png"/>
                     <pic:cNvPicPr preferRelativeResize="0"/>
                   </pic:nvPicPr>
                   <pic:blipFill>
@@ -4933,7 +4760,7 @@
                   <pic:spPr>
                     <a:xfrm>
                       <a:off x="0" y="0"/>
-                      <a:ext cx="3295650" cy="3322887"/>
+                      <a:ext cx="3586494" cy="2999963"/>
                     </a:xfrm>
                     <a:prstGeom prst="rect"/>
                     <a:ln/>
@@ -4944,25 +4771,306 @@
           </wp:anchor>
         </w:drawing>
       </w:r>
+    </w:p>
+    <w:p>
+      <w:pPr>
+        <w:spacing w:line="360" w:lineRule="auto"/>
+        <w:ind w:left="0" w:firstLine="0"/>
+        <w:rPr>
+          <w:b w:val="1"/>
+          <w:bCs w:val="1"/>
+          <w:sz w:val="28"/>
+          <w:szCs w:val="28"/>
+          <w:u w:val="single"/>
+        </w:rPr>
+      </w:pPr>
+      <w:r>
+        <w:rPr>
+          <w:b w:val="1"/>
+          <w:bCs w:val="1"/>
+          <w:sz w:val="28"/>
+          <w:szCs w:val="28"/>
+          <w:u w:val="single"/>
+          <w:rtl w:val="0"/>
+        </w:rPr>
+        <w:t xml:space="preserve">Sign Up Window</w:t>
+      </w:r>
+    </w:p>
+    <w:p>
+      <w:pPr>
+        <w:numPr>
+          <w:ilvl w:val="0"/>
+          <w:numId w:val="34"/>
+        </w:numPr>
+        <w:spacing w:line="360" w:lineRule="auto"/>
+        <w:ind w:left="720" w:hanging="360"/>
+        <w:rPr>
+          <w:u w:val="none"/>
+        </w:rPr>
+      </w:pPr>
+      <w:r>
+        <w:rPr>
+          <w:i w:val="1"/>
+          <w:iCs w:val="1"/>
+          <w:rtl w:val="0"/>
+        </w:rPr>
+        <w:t xml:space="preserve">Labels</w:t>
+      </w:r>
+      <w:r>
+        <w:rPr>
+          <w:rtl w:val="0"/>
+        </w:rPr>
+        <w:t xml:space="preserve">: Username, New Password, Confirm Password, Info for password requirements</w:t>
+      </w:r>
+    </w:p>
+    <w:p>
+      <w:pPr>
+        <w:numPr>
+          <w:ilvl w:val="0"/>
+          <w:numId w:val="34"/>
+        </w:numPr>
+        <w:spacing w:line="360" w:lineRule="auto"/>
+        <w:ind w:left="720" w:hanging="360"/>
+        <w:rPr>
+          <w:u w:val="none"/>
+        </w:rPr>
+      </w:pPr>
+      <w:r>
+        <w:rPr>
+          <w:i w:val="1"/>
+          <w:iCs w:val="1"/>
+          <w:rtl w:val="0"/>
+        </w:rPr>
+        <w:t xml:space="preserve">Textfields</w:t>
+      </w:r>
+      <w:r>
+        <w:rPr>
+          <w:rtl w:val="0"/>
+        </w:rPr>
+        <w:t xml:space="preserve">: Username, New Password, Confirm Password</w:t>
+      </w:r>
+    </w:p>
+    <w:p>
+      <w:pPr>
+        <w:numPr>
+          <w:ilvl w:val="0"/>
+          <w:numId w:val="34"/>
+        </w:numPr>
+        <w:spacing w:line="360" w:lineRule="auto"/>
+        <w:ind w:left="720" w:hanging="360"/>
+        <w:rPr>
+          <w:u w:val="none"/>
+        </w:rPr>
+      </w:pPr>
+      <w:r>
+        <w:rPr>
+          <w:i w:val="1"/>
+          <w:iCs w:val="1"/>
+          <w:rtl w:val="0"/>
+        </w:rPr>
+        <w:t xml:space="preserve">Buttons</w:t>
+      </w:r>
+      <w:r>
+        <w:rPr>
+          <w:rtl w:val="0"/>
+        </w:rPr>
+        <w:t xml:space="preserve">: Sign Up</w:t>
+      </w:r>
+    </w:p>
+    <w:p>
+      <w:pPr>
+        <w:ind w:firstLine="720"/>
+        <w:rPr/>
+      </w:pPr>
+      <w:r>
+        <w:rPr>
+          <w:rtl w:val="0"/>
+        </w:rPr>
+      </w:r>
+    </w:p>
+    <w:p>
+      <w:pPr>
+        <w:ind w:firstLine="720"/>
+        <w:rPr/>
+      </w:pPr>
+      <w:r>
+        <w:rPr>
+          <w:rtl w:val="0"/>
+        </w:rPr>
+      </w:r>
+    </w:p>
+    <w:p>
+      <w:pPr>
+        <w:ind w:firstLine="720"/>
+        <w:rPr/>
+      </w:pPr>
+      <w:r>
+        <w:rPr>
+          <w:rtl w:val="0"/>
+        </w:rPr>
+      </w:r>
+    </w:p>
+    <w:p>
+      <w:pPr>
+        <w:ind w:firstLine="720"/>
+        <w:rPr/>
+      </w:pPr>
+      <w:r>
+        <w:rPr>
+          <w:rtl w:val="0"/>
+        </w:rPr>
+      </w:r>
+    </w:p>
+    <w:p>
+      <w:pPr>
+        <w:ind w:firstLine="720"/>
+        <w:rPr/>
+      </w:pPr>
+      <w:r>
+        <w:rPr>
+          <w:rtl w:val="0"/>
+        </w:rPr>
+      </w:r>
+    </w:p>
+    <w:p>
+      <w:pPr>
+        <w:ind w:firstLine="720"/>
+        <w:rPr/>
+      </w:pPr>
+      <w:r>
+        <w:rPr>
+          <w:rtl w:val="0"/>
+        </w:rPr>
+      </w:r>
+    </w:p>
+    <w:p>
+      <w:pPr>
+        <w:ind w:firstLine="720"/>
+        <w:rPr/>
+      </w:pPr>
+      <w:r>
+        <w:rPr>
+          <w:rtl w:val="0"/>
+        </w:rPr>
+      </w:r>
+    </w:p>
+    <w:p>
+      <w:pPr>
+        <w:ind w:firstLine="720"/>
+        <w:rPr/>
+      </w:pPr>
+      <w:r>
+        <w:rPr>
+          <w:rtl w:val="0"/>
+        </w:rPr>
+      </w:r>
+    </w:p>
+    <w:p>
+      <w:pPr>
+        <w:ind w:firstLine="720"/>
+        <w:rPr/>
+      </w:pPr>
+      <w:r>
+        <w:rPr>
+          <w:rtl w:val="0"/>
+        </w:rPr>
+      </w:r>
+    </w:p>
+    <w:p>
+      <w:pPr>
+        <w:ind w:firstLine="720"/>
+        <w:rPr/>
+      </w:pPr>
+      <w:r>
+        <w:rPr>
+          <w:rtl w:val="0"/>
+        </w:rPr>
+      </w:r>
+    </w:p>
+    <w:p>
+      <w:pPr>
+        <w:ind w:firstLine="720"/>
+        <w:rPr/>
+      </w:pPr>
+      <w:r>
+        <w:rPr>
+          <w:rtl w:val="0"/>
+        </w:rPr>
+      </w:r>
+    </w:p>
+    <w:p>
+      <w:pPr>
+        <w:ind w:left="0" w:firstLine="0"/>
+        <w:rPr/>
+      </w:pPr>
+      <w:r>
+        <w:rPr>
+          <w:rtl w:val="0"/>
+        </w:rPr>
+      </w:r>
+    </w:p>
+    <w:p>
+      <w:pPr>
+        <w:ind w:left="0" w:firstLine="0"/>
+        <w:rPr/>
+      </w:pPr>
+      <w:r>
+        <w:rPr>
+          <w:rtl w:val="0"/>
+        </w:rPr>
+      </w:r>
+    </w:p>
+    <w:p>
+      <w:pPr>
+        <w:ind w:left="0" w:firstLine="0"/>
+        <w:rPr/>
+      </w:pPr>
+      <w:r>
+        <w:rPr>
+          <w:rtl w:val="0"/>
+        </w:rPr>
+      </w:r>
+    </w:p>
+    <w:p>
+      <w:pPr>
+        <w:ind w:firstLine="720"/>
+        <w:rPr/>
+      </w:pPr>
+      <w:r>
+        <w:rPr>
+          <w:rtl w:val="0"/>
+        </w:rPr>
+      </w:r>
+    </w:p>
+    <w:p>
+      <w:pPr>
+        <w:ind w:firstLine="720"/>
+        <w:rPr/>
+      </w:pPr>
+      <w:r>
+        <w:rPr>
+          <w:rtl w:val="0"/>
+        </w:rPr>
+      </w:r>
       <w:r>
         <w:drawing>
           <wp:anchor allowOverlap="1" behindDoc="0" distB="114300" distT="114300" distL="114300" distR="114300" hidden="0" layoutInCell="1" locked="0" relativeHeight="0" simplePos="0">
             <wp:simplePos x="0" y="0"/>
             <wp:positionH relativeFrom="column">
-              <wp:posOffset>-333374</wp:posOffset>
+              <wp:posOffset>2524125</wp:posOffset>
             </wp:positionH>
             <wp:positionV relativeFrom="paragraph">
-              <wp:posOffset>323850</wp:posOffset>
+              <wp:posOffset>289513</wp:posOffset>
             </wp:positionV>
-            <wp:extent cx="3295650" cy="3295650"/>
+            <wp:extent cx="4014415" cy="3247262"/>
             <wp:effectExtent b="0" l="0" r="0" t="0"/>
             <wp:wrapSquare wrapText="bothSides" distB="114300" distT="114300" distL="114300" distR="114300"/>
-            <wp:docPr id="3" name="image19.jpg"/>
+            <wp:docPr id="14" name="image5.png"/>
             <a:graphic>
               <a:graphicData uri="http://schemas.openxmlformats.org/drawingml/2006/picture">
                 <pic:pic>
                   <pic:nvPicPr>
-                    <pic:cNvPr id="0" name="image19.jpg"/>
+                    <pic:cNvPr id="0" name="image5.png"/>
                     <pic:cNvPicPr preferRelativeResize="0"/>
                   </pic:nvPicPr>
                   <pic:blipFill>
@@ -4975,7 +5083,7 @@
                   <pic:spPr>
                     <a:xfrm>
                       <a:off x="0" y="0"/>
-                      <a:ext cx="3295650" cy="3295650"/>
+                      <a:ext cx="4014415" cy="3247262"/>
                     </a:xfrm>
                     <a:prstGeom prst="rect"/>
                     <a:ln/>
@@ -5008,7 +5116,7 @@
           <w:u w:val="single"/>
           <w:rtl w:val="0"/>
         </w:rPr>
-        <w:t xml:space="preserve">Lobby Windows</w:t>
+        <w:t xml:space="preserve">Game Tables Window</w:t>
       </w:r>
     </w:p>
     <w:p>
@@ -5029,21 +5137,13 @@
           <w:iCs w:val="1"/>
           <w:rtl w:val="0"/>
         </w:rPr>
-        <w:t xml:space="preserve">J</w:t>
-      </w:r>
-      <w:r>
-        <w:rPr>
-          <w:i w:val="1"/>
-          <w:iCs w:val="1"/>
-          <w:rtl w:val="0"/>
-        </w:rPr>
         <w:t xml:space="preserve">Labels</w:t>
       </w:r>
       <w:r>
         <w:rPr>
           <w:rtl w:val="0"/>
         </w:rPr>
-        <w:t xml:space="preserve">: How To Play, Join a Game!</w:t>
+        <w:t xml:space="preserve">: How To Play Info, Hello User, Capacity of each table (#/6, if max reached says Full!), User’s balance</w:t>
       </w:r>
     </w:p>
     <w:p>
@@ -5064,19 +5164,117 @@
           <w:iCs w:val="1"/>
           <w:rtl w:val="0"/>
         </w:rPr>
-        <w:t xml:space="preserve">JButtons</w:t>
-      </w:r>
-      <w:r>
-        <w:rPr>
-          <w:rtl w:val="0"/>
-        </w:rPr>
-        <w:t xml:space="preserve">: Account, Logout, Join Table, Deposit, Cash out, Close</w:t>
-      </w:r>
-    </w:p>
-    <w:p>
-      <w:pPr>
-        <w:spacing w:line="360" w:lineRule="auto"/>
-        <w:ind w:left="720" w:firstLine="0"/>
+        <w:t xml:space="preserve">Buttons</w:t>
+      </w:r>
+      <w:r>
+        <w:rPr>
+          <w:rtl w:val="0"/>
+        </w:rPr>
+        <w:t xml:space="preserve">: Update Profile, Log Out, View Full Game Rules</w:t>
+      </w:r>
+    </w:p>
+    <w:p>
+      <w:pPr>
+        <w:ind w:firstLine="720"/>
+        <w:rPr/>
+      </w:pPr>
+      <w:r>
+        <w:rPr>
+          <w:rtl w:val="0"/>
+        </w:rPr>
+      </w:r>
+    </w:p>
+    <w:p>
+      <w:pPr>
+        <w:ind w:firstLine="720"/>
+        <w:rPr/>
+      </w:pPr>
+      <w:r>
+        <w:rPr>
+          <w:rtl w:val="0"/>
+        </w:rPr>
+      </w:r>
+    </w:p>
+    <w:p>
+      <w:pPr>
+        <w:ind w:firstLine="720"/>
+        <w:rPr/>
+      </w:pPr>
+      <w:r>
+        <w:rPr>
+          <w:rtl w:val="0"/>
+        </w:rPr>
+      </w:r>
+    </w:p>
+    <w:p>
+      <w:pPr>
+        <w:ind w:firstLine="720"/>
+        <w:rPr/>
+      </w:pPr>
+      <w:r>
+        <w:rPr>
+          <w:rtl w:val="0"/>
+        </w:rPr>
+      </w:r>
+    </w:p>
+    <w:p>
+      <w:pPr>
+        <w:ind w:firstLine="720"/>
+        <w:rPr/>
+      </w:pPr>
+      <w:r>
+        <w:rPr>
+          <w:rtl w:val="0"/>
+        </w:rPr>
+      </w:r>
+    </w:p>
+    <w:p>
+      <w:pPr>
+        <w:ind w:firstLine="720"/>
+        <w:rPr/>
+      </w:pPr>
+      <w:r>
+        <w:rPr>
+          <w:rtl w:val="0"/>
+        </w:rPr>
+      </w:r>
+    </w:p>
+    <w:p>
+      <w:pPr>
+        <w:ind w:firstLine="720"/>
+        <w:rPr/>
+      </w:pPr>
+      <w:r>
+        <w:rPr>
+          <w:rtl w:val="0"/>
+        </w:rPr>
+      </w:r>
+    </w:p>
+    <w:p>
+      <w:pPr>
+        <w:ind w:firstLine="720"/>
+        <w:rPr/>
+      </w:pPr>
+      <w:r>
+        <w:rPr>
+          <w:rtl w:val="0"/>
+        </w:rPr>
+      </w:r>
+    </w:p>
+    <w:p>
+      <w:pPr>
+        <w:ind w:firstLine="720"/>
+        <w:rPr/>
+      </w:pPr>
+      <w:r>
+        <w:rPr>
+          <w:rtl w:val="0"/>
+        </w:rPr>
+      </w:r>
+    </w:p>
+    <w:p>
+      <w:pPr>
+        <w:ind w:left="0" w:firstLine="0"/>
         <w:rPr/>
       </w:pPr>
       <w:r>
@@ -5089,20 +5287,20 @@
           <wp:anchor allowOverlap="1" behindDoc="0" distB="114300" distT="114300" distL="114300" distR="114300" hidden="0" layoutInCell="1" locked="0" relativeHeight="0" simplePos="0">
             <wp:simplePos x="0" y="0"/>
             <wp:positionH relativeFrom="column">
-              <wp:posOffset>3038475</wp:posOffset>
+              <wp:posOffset>3381375</wp:posOffset>
             </wp:positionH>
             <wp:positionV relativeFrom="paragraph">
-              <wp:posOffset>190500</wp:posOffset>
+              <wp:posOffset>180975</wp:posOffset>
             </wp:positionV>
-            <wp:extent cx="3429000" cy="2767760"/>
+            <wp:extent cx="3148013" cy="4031839"/>
             <wp:effectExtent b="0" l="0" r="0" t="0"/>
             <wp:wrapSquare wrapText="bothSides" distB="114300" distT="114300" distL="114300" distR="114300"/>
-            <wp:docPr id="5" name="image4.jpg"/>
+            <wp:docPr id="4" name="image2.png"/>
             <a:graphic>
               <a:graphicData uri="http://schemas.openxmlformats.org/drawingml/2006/picture">
                 <pic:pic>
                   <pic:nvPicPr>
-                    <pic:cNvPr id="0" name="image4.jpg"/>
+                    <pic:cNvPr id="0" name="image2.png"/>
                     <pic:cNvPicPr preferRelativeResize="0"/>
                   </pic:nvPicPr>
                   <pic:blipFill>
@@ -5115,7 +5313,7 @@
                   <pic:spPr>
                     <a:xfrm>
                       <a:off x="0" y="0"/>
-                      <a:ext cx="3429000" cy="2767760"/>
+                      <a:ext cx="3148013" cy="4031839"/>
                     </a:xfrm>
                     <a:prstGeom prst="rect"/>
                     <a:ln/>
@@ -5126,48 +5324,6 @@
           </wp:anchor>
         </w:drawing>
       </w:r>
-      <w:r>
-        <w:drawing>
-          <wp:anchor allowOverlap="1" behindDoc="0" distB="114300" distT="114300" distL="114300" distR="114300" hidden="0" layoutInCell="1" locked="0" relativeHeight="0" simplePos="0">
-            <wp:simplePos x="0" y="0"/>
-            <wp:positionH relativeFrom="column">
-              <wp:posOffset>-571499</wp:posOffset>
-            </wp:positionH>
-            <wp:positionV relativeFrom="paragraph">
-              <wp:posOffset>193337</wp:posOffset>
-            </wp:positionV>
-            <wp:extent cx="3429000" cy="2773831"/>
-            <wp:effectExtent b="0" l="0" r="0" t="0"/>
-            <wp:wrapSquare wrapText="bothSides" distB="114300" distT="114300" distL="114300" distR="114300"/>
-            <wp:docPr id="15" name="image6.jpg"/>
-            <a:graphic>
-              <a:graphicData uri="http://schemas.openxmlformats.org/drawingml/2006/picture">
-                <pic:pic>
-                  <pic:nvPicPr>
-                    <pic:cNvPr id="0" name="image6.jpg"/>
-                    <pic:cNvPicPr preferRelativeResize="0"/>
-                  </pic:nvPicPr>
-                  <pic:blipFill>
-                    <a:blip r:embed="rId10"/>
-                    <a:srcRect b="0" l="0" r="0" t="0"/>
-                    <a:stretch>
-                      <a:fillRect/>
-                    </a:stretch>
-                  </pic:blipFill>
-                  <pic:spPr>
-                    <a:xfrm>
-                      <a:off x="0" y="0"/>
-                      <a:ext cx="3429000" cy="2773831"/>
-                    </a:xfrm>
-                    <a:prstGeom prst="rect"/>
-                    <a:ln/>
-                  </pic:spPr>
-                </pic:pic>
-              </a:graphicData>
-            </a:graphic>
-          </wp:anchor>
-        </w:drawing>
-      </w:r>
     </w:p>
     <w:p>
       <w:pPr>
@@ -5211,21 +5367,13 @@
           <w:iCs w:val="1"/>
           <w:rtl w:val="0"/>
         </w:rPr>
-        <w:t xml:space="preserve">J</w:t>
-      </w:r>
-      <w:r>
-        <w:rPr>
-          <w:i w:val="1"/>
-          <w:iCs w:val="1"/>
-          <w:rtl w:val="0"/>
-        </w:rPr>
         <w:t xml:space="preserve">Labels</w:t>
       </w:r>
       <w:r>
         <w:rPr>
           <w:rtl w:val="0"/>
         </w:rPr>
-        <w:t xml:space="preserve">: Score, Bet, Player #</w:t>
+        <w:t xml:space="preserve">: Dollar Amount in Pot, User Balance</w:t>
       </w:r>
     </w:p>
     <w:p>
@@ -5254,48 +5402,6 @@
         </w:rPr>
         <w:t xml:space="preserve">: Hit, Stand, Fold, Leave Table</w:t>
       </w:r>
-      <w:r>
-        <w:drawing>
-          <wp:anchor allowOverlap="1" behindDoc="0" distB="114300" distT="114300" distL="114300" distR="114300" hidden="0" layoutInCell="1" locked="0" relativeHeight="0" simplePos="0">
-            <wp:simplePos x="0" y="0"/>
-            <wp:positionH relativeFrom="column">
-              <wp:posOffset>3124200</wp:posOffset>
-            </wp:positionH>
-            <wp:positionV relativeFrom="paragraph">
-              <wp:posOffset>336212</wp:posOffset>
-            </wp:positionV>
-            <wp:extent cx="3481388" cy="2811890"/>
-            <wp:effectExtent b="0" l="0" r="0" t="0"/>
-            <wp:wrapSquare wrapText="bothSides" distB="114300" distT="114300" distL="114300" distR="114300"/>
-            <wp:docPr id="14" name="image5.jpg"/>
-            <a:graphic>
-              <a:graphicData uri="http://schemas.openxmlformats.org/drawingml/2006/picture">
-                <pic:pic>
-                  <pic:nvPicPr>
-                    <pic:cNvPr id="0" name="image5.jpg"/>
-                    <pic:cNvPicPr preferRelativeResize="0"/>
-                  </pic:nvPicPr>
-                  <pic:blipFill>
-                    <a:blip r:embed="rId11"/>
-                    <a:srcRect b="0" l="0" r="0" t="0"/>
-                    <a:stretch>
-                      <a:fillRect/>
-                    </a:stretch>
-                  </pic:blipFill>
-                  <pic:spPr>
-                    <a:xfrm>
-                      <a:off x="0" y="0"/>
-                      <a:ext cx="3481388" cy="2811890"/>
-                    </a:xfrm>
-                    <a:prstGeom prst="rect"/>
-                    <a:ln/>
-                  </pic:spPr>
-                </pic:pic>
-              </a:graphicData>
-            </a:graphic>
-          </wp:anchor>
-        </w:drawing>
-      </w:r>
     </w:p>
     <w:p>
       <w:pPr>
@@ -5307,48 +5413,6 @@
         <w:rPr>
           <w:rtl w:val="0"/>
         </w:rPr>
-      </w:r>
-      <w:r>
-        <w:drawing>
-          <wp:anchor allowOverlap="1" behindDoc="0" distB="114300" distT="114300" distL="114300" distR="114300" hidden="0" layoutInCell="1" locked="0" relativeHeight="0" simplePos="0">
-            <wp:simplePos x="0" y="0"/>
-            <wp:positionH relativeFrom="column">
-              <wp:posOffset>-723899</wp:posOffset>
-            </wp:positionH>
-            <wp:positionV relativeFrom="paragraph">
-              <wp:posOffset>118425</wp:posOffset>
-            </wp:positionV>
-            <wp:extent cx="3426055" cy="2771640"/>
-            <wp:effectExtent b="0" l="0" r="0" t="0"/>
-            <wp:wrapSquare wrapText="bothSides" distB="114300" distT="114300" distL="114300" distR="114300"/>
-            <wp:docPr id="11" name="image3.jpg"/>
-            <a:graphic>
-              <a:graphicData uri="http://schemas.openxmlformats.org/drawingml/2006/picture">
-                <pic:pic>
-                  <pic:nvPicPr>
-                    <pic:cNvPr id="0" name="image3.jpg"/>
-                    <pic:cNvPicPr preferRelativeResize="0"/>
-                  </pic:nvPicPr>
-                  <pic:blipFill>
-                    <a:blip r:embed="rId12"/>
-                    <a:srcRect b="0" l="0" r="0" t="0"/>
-                    <a:stretch>
-                      <a:fillRect/>
-                    </a:stretch>
-                  </pic:blipFill>
-                  <pic:spPr>
-                    <a:xfrm>
-                      <a:off x="0" y="0"/>
-                      <a:ext cx="3426055" cy="2771640"/>
-                    </a:xfrm>
-                    <a:prstGeom prst="rect"/>
-                    <a:ln/>
-                  </pic:spPr>
-                </pic:pic>
-              </a:graphicData>
-            </a:graphic>
-          </wp:anchor>
-        </w:drawing>
       </w:r>
     </w:p>
     <w:p>
@@ -13968,7 +14032,7 @@
           <wp:inline distB="114300" distT="114300" distL="114300" distR="114300">
             <wp:extent cx="5943600" cy="4241800"/>
             <wp:effectExtent b="0" l="0" r="0" t="0"/>
-            <wp:docPr id="22" name="image14.png"/>
+            <wp:docPr id="20" name="image14.png"/>
             <a:graphic>
               <a:graphicData uri="http://schemas.openxmlformats.org/drawingml/2006/picture">
                 <pic:pic>
@@ -13977,7 +14041,7 @@
                     <pic:cNvPicPr preferRelativeResize="0"/>
                   </pic:nvPicPr>
                   <pic:blipFill>
-                    <a:blip r:embed="rId13"/>
+                    <a:blip r:embed="rId10"/>
                     <a:srcRect b="0" l="0" r="0" t="0"/>
                     <a:stretch>
                       <a:fillRect/>
@@ -14057,16 +14121,16 @@
           <wp:inline distB="114300" distT="114300" distL="114300" distR="114300">
             <wp:extent cx="6786563" cy="5709848"/>
             <wp:effectExtent b="0" l="0" r="0" t="0"/>
-            <wp:docPr id="10" name="image7.png"/>
+            <wp:docPr id="10" name="image13.png"/>
             <a:graphic>
               <a:graphicData uri="http://schemas.openxmlformats.org/drawingml/2006/picture">
                 <pic:pic>
                   <pic:nvPicPr>
-                    <pic:cNvPr id="0" name="image7.png"/>
+                    <pic:cNvPr id="0" name="image13.png"/>
                     <pic:cNvPicPr preferRelativeResize="0"/>
                   </pic:nvPicPr>
                   <pic:blipFill>
-                    <a:blip r:embed="rId14"/>
+                    <a:blip r:embed="rId11"/>
                     <a:srcRect b="0" l="0" r="0" t="0"/>
                     <a:stretch>
                       <a:fillRect/>
@@ -14236,18 +14300,18 @@
         </w:rPr>
         <w:drawing>
           <wp:inline distB="114300" distT="114300" distL="114300" distR="114300">
-            <wp:extent cx="6224588" cy="7362825"/>
+            <wp:extent cx="3662363" cy="7365193"/>
             <wp:effectExtent b="0" l="0" r="0" t="0"/>
-            <wp:docPr id="18" name="image21.png"/>
+            <wp:docPr id="9" name="image19.png"/>
             <a:graphic>
               <a:graphicData uri="http://schemas.openxmlformats.org/drawingml/2006/picture">
                 <pic:pic>
                   <pic:nvPicPr>
-                    <pic:cNvPr id="0" name="image21.png"/>
+                    <pic:cNvPr id="0" name="image19.png"/>
                     <pic:cNvPicPr preferRelativeResize="0"/>
                   </pic:nvPicPr>
                   <pic:blipFill>
-                    <a:blip r:embed="rId15"/>
+                    <a:blip r:embed="rId12"/>
                     <a:srcRect b="0" l="0" r="0" t="0"/>
                     <a:stretch>
                       <a:fillRect/>
@@ -14256,7 +14320,7 @@
                   <pic:spPr>
                     <a:xfrm>
                       <a:off x="0" y="0"/>
-                      <a:ext cx="6224588" cy="7362825"/>
+                      <a:ext cx="3662363" cy="7365193"/>
                     </a:xfrm>
                     <a:prstGeom prst="rect"/>
                     <a:ln/>
@@ -14326,21 +14390,6 @@
       </w:pPr>
       <w:r>
         <w:rPr>
-          <w:rtl w:val="0"/>
-        </w:rPr>
-      </w:r>
-    </w:p>
-    <w:p>
-      <w:pPr>
-        <w:rPr>
-          <w:b w:val="1"/>
-          <w:bCs w:val="1"/>
-          <w:sz w:val="26"/>
-          <w:szCs w:val="26"/>
-        </w:rPr>
-      </w:pPr>
-      <w:r>
-        <w:rPr>
           <w:b w:val="1"/>
           <w:bCs w:val="1"/>
           <w:sz w:val="26"/>
@@ -14348,18 +14397,18 @@
         </w:rPr>
         <w:drawing>
           <wp:inline distB="114300" distT="114300" distL="114300" distR="114300">
-            <wp:extent cx="6796088" cy="4911916"/>
+            <wp:extent cx="5943600" cy="4292600"/>
             <wp:effectExtent b="0" l="0" r="0" t="0"/>
-            <wp:docPr id="2" name="image9.png"/>
+            <wp:docPr id="11" name="image4.png"/>
             <a:graphic>
               <a:graphicData uri="http://schemas.openxmlformats.org/drawingml/2006/picture">
                 <pic:pic>
                   <pic:nvPicPr>
-                    <pic:cNvPr id="0" name="image9.png"/>
+                    <pic:cNvPr id="0" name="image4.png"/>
                     <pic:cNvPicPr preferRelativeResize="0"/>
                   </pic:nvPicPr>
                   <pic:blipFill>
-                    <a:blip r:embed="rId16"/>
+                    <a:blip r:embed="rId13"/>
                     <a:srcRect b="0" l="0" r="0" t="0"/>
                     <a:stretch>
                       <a:fillRect/>
@@ -14368,7 +14417,7 @@
                   <pic:spPr>
                     <a:xfrm>
                       <a:off x="0" y="0"/>
-                      <a:ext cx="6796088" cy="4911916"/>
+                      <a:ext cx="5943600" cy="4292600"/>
                     </a:xfrm>
                     <a:prstGeom prst="rect"/>
                     <a:ln/>
@@ -14611,6 +14660,22 @@
     </w:p>
     <w:p>
       <w:pPr>
+        <w:ind w:left="0" w:firstLine="0"/>
+        <w:rPr>
+          <w:b w:val="1"/>
+          <w:bCs w:val="1"/>
+          <w:sz w:val="26"/>
+          <w:szCs w:val="26"/>
+        </w:rPr>
+      </w:pPr>
+      <w:r>
+        <w:rPr>
+          <w:rtl w:val="0"/>
+        </w:rPr>
+      </w:r>
+    </w:p>
+    <w:p>
+      <w:pPr>
         <w:ind w:left="720" w:firstLine="0"/>
         <w:rPr>
           <w:b w:val="1"/>
@@ -14670,16 +14735,16 @@
           <wp:inline distB="114300" distT="114300" distL="114300" distR="114300">
             <wp:extent cx="6148388" cy="6699139"/>
             <wp:effectExtent b="0" l="0" r="0" t="0"/>
-            <wp:docPr id="17" name="image18.png"/>
+            <wp:docPr id="16" name="image11.png"/>
             <a:graphic>
               <a:graphicData uri="http://schemas.openxmlformats.org/drawingml/2006/picture">
                 <pic:pic>
                   <pic:nvPicPr>
-                    <pic:cNvPr id="0" name="image18.png"/>
+                    <pic:cNvPr id="0" name="image11.png"/>
                     <pic:cNvPicPr preferRelativeResize="0"/>
                   </pic:nvPicPr>
                   <pic:blipFill>
-                    <a:blip r:embed="rId17"/>
+                    <a:blip r:embed="rId14"/>
                     <a:srcRect b="0" l="0" r="0" t="0"/>
                     <a:stretch>
                       <a:fillRect/>
@@ -14800,16 +14865,16 @@
           <wp:inline distB="114300" distT="114300" distL="114300" distR="114300">
             <wp:extent cx="5943600" cy="5321300"/>
             <wp:effectExtent b="0" l="0" r="0" t="0"/>
-            <wp:docPr id="13" name="image13.png"/>
+            <wp:docPr id="13" name="image8.png"/>
             <a:graphic>
               <a:graphicData uri="http://schemas.openxmlformats.org/drawingml/2006/picture">
                 <pic:pic>
                   <pic:nvPicPr>
-                    <pic:cNvPr id="0" name="image13.png"/>
+                    <pic:cNvPr id="0" name="image8.png"/>
                     <pic:cNvPicPr preferRelativeResize="0"/>
                   </pic:nvPicPr>
                   <pic:blipFill>
-                    <a:blip r:embed="rId18"/>
+                    <a:blip r:embed="rId15"/>
                     <a:srcRect b="0" l="0" r="0" t="0"/>
                     <a:stretch>
                       <a:fillRect/>
@@ -15077,16 +15142,16 @@
           <wp:inline distB="114300" distT="114300" distL="114300" distR="114300">
             <wp:extent cx="5943600" cy="5880100"/>
             <wp:effectExtent b="0" l="0" r="0" t="0"/>
-            <wp:docPr id="12" name="image12.png"/>
+            <wp:docPr id="12" name="image6.png"/>
             <a:graphic>
               <a:graphicData uri="http://schemas.openxmlformats.org/drawingml/2006/picture">
                 <pic:pic>
                   <pic:nvPicPr>
-                    <pic:cNvPr id="0" name="image12.png"/>
+                    <pic:cNvPr id="0" name="image6.png"/>
                     <pic:cNvPicPr preferRelativeResize="0"/>
                   </pic:nvPicPr>
                   <pic:blipFill>
-                    <a:blip r:embed="rId19"/>
+                    <a:blip r:embed="rId16"/>
                     <a:srcRect b="0" l="0" r="0" t="0"/>
                     <a:stretch>
                       <a:fillRect/>
@@ -15264,6 +15329,16 @@
         </w:rPr>
         <w:t xml:space="preserve">Use Case ID: 006 – Create New Table</w:t>
       </w:r>
+    </w:p>
+    <w:p>
+      <w:pPr>
+        <w:rPr>
+          <w:b w:val="1"/>
+          <w:bCs w:val="1"/>
+          <w:sz w:val="26"/>
+          <w:szCs w:val="26"/>
+        </w:rPr>
+      </w:pPr>
       <w:r>
         <w:rPr>
           <w:b w:val="1"/>
@@ -15275,16 +15350,16 @@
           <wp:inline distB="114300" distT="114300" distL="114300" distR="114300">
             <wp:extent cx="5100638" cy="7948174"/>
             <wp:effectExtent b="0" l="0" r="0" t="0"/>
-            <wp:docPr id="4" name="image22.png"/>
+            <wp:docPr id="3" name="image18.png"/>
             <a:graphic>
               <a:graphicData uri="http://schemas.openxmlformats.org/drawingml/2006/picture">
                 <pic:pic>
                   <pic:nvPicPr>
-                    <pic:cNvPr id="0" name="image22.png"/>
+                    <pic:cNvPr id="0" name="image18.png"/>
                     <pic:cNvPicPr preferRelativeResize="0"/>
                   </pic:nvPicPr>
                   <pic:blipFill>
-                    <a:blip r:embed="rId20"/>
+                    <a:blip r:embed="rId17"/>
                     <a:srcRect b="0" l="0" r="0" t="0"/>
                     <a:stretch>
                       <a:fillRect/>
@@ -15355,16 +15430,16 @@
           <wp:inline distB="114300" distT="114300" distL="114300" distR="114300">
             <wp:extent cx="6234113" cy="3286896"/>
             <wp:effectExtent b="0" l="0" r="0" t="0"/>
-            <wp:docPr id="20" name="image1.png"/>
+            <wp:docPr id="18" name="image12.png"/>
             <a:graphic>
               <a:graphicData uri="http://schemas.openxmlformats.org/drawingml/2006/picture">
                 <pic:pic>
                   <pic:nvPicPr>
-                    <pic:cNvPr id="0" name="image1.png"/>
+                    <pic:cNvPr id="0" name="image12.png"/>
                     <pic:cNvPicPr preferRelativeResize="0"/>
                   </pic:nvPicPr>
                   <pic:blipFill>
-                    <a:blip r:embed="rId21"/>
+                    <a:blip r:embed="rId18"/>
                     <a:srcRect b="0" l="0" r="0" t="0"/>
                     <a:stretch>
                       <a:fillRect/>
@@ -15435,16 +15510,16 @@
           <wp:inline distB="114300" distT="114300" distL="114300" distR="114300">
             <wp:extent cx="6745553" cy="2733621"/>
             <wp:effectExtent b="0" l="0" r="0" t="0"/>
-            <wp:docPr id="23" name="image15.png"/>
+            <wp:docPr id="21" name="image17.png"/>
             <a:graphic>
               <a:graphicData uri="http://schemas.openxmlformats.org/drawingml/2006/picture">
                 <pic:pic>
                   <pic:nvPicPr>
-                    <pic:cNvPr id="0" name="image15.png"/>
+                    <pic:cNvPr id="0" name="image17.png"/>
                     <pic:cNvPicPr preferRelativeResize="0"/>
                   </pic:nvPicPr>
                   <pic:blipFill>
-                    <a:blip r:embed="rId22"/>
+                    <a:blip r:embed="rId19"/>
                     <a:srcRect b="0" l="0" r="0" t="0"/>
                     <a:stretch>
                       <a:fillRect/>
@@ -15620,16 +15695,16 @@
           <wp:inline distB="114300" distT="114300" distL="114300" distR="114300">
             <wp:extent cx="5705825" cy="3339261"/>
             <wp:effectExtent b="0" l="0" r="0" t="0"/>
-            <wp:docPr id="8" name="image8.png"/>
+            <wp:docPr id="7" name="image3.png"/>
             <a:graphic>
               <a:graphicData uri="http://schemas.openxmlformats.org/drawingml/2006/picture">
                 <pic:pic>
                   <pic:nvPicPr>
-                    <pic:cNvPr id="0" name="image8.png"/>
+                    <pic:cNvPr id="0" name="image3.png"/>
                     <pic:cNvPicPr preferRelativeResize="0"/>
                   </pic:nvPicPr>
                   <pic:blipFill>
-                    <a:blip r:embed="rId23"/>
+                    <a:blip r:embed="rId20"/>
                     <a:srcRect b="0" l="0" r="0" t="0"/>
                     <a:stretch>
                       <a:fillRect/>
@@ -17358,16 +17433,16 @@
               <wp:inline distB="114300" distT="114300" distL="114300" distR="114300">
                 <wp:extent cx="4872299" cy="3833813"/>
                 <wp:effectExtent b="0" l="0" r="0" t="0"/>
-                <wp:docPr id="1" name="image20.png"/>
+                <wp:docPr id="1" name="image15.png"/>
                 <a:graphic>
                   <a:graphicData uri="http://schemas.openxmlformats.org/drawingml/2006/picture">
                     <pic:pic>
                       <pic:nvPicPr>
-                        <pic:cNvPr id="0" name="image20.png"/>
+                        <pic:cNvPr id="0" name="image15.png"/>
                         <pic:cNvPicPr preferRelativeResize="0"/>
                       </pic:nvPicPr>
                       <pic:blipFill>
-                        <a:blip r:embed="rId24"/>
+                        <a:blip r:embed="rId21"/>
                         <a:srcRect/>
                         <a:stretch>
                           <a:fillRect/>
@@ -17485,16 +17560,16 @@
           <wp:inline distB="114300" distT="114300" distL="114300" distR="114300">
             <wp:extent cx="6653213" cy="5493568"/>
             <wp:effectExtent b="0" l="0" r="0" t="0"/>
-            <wp:docPr id="19" name="image10.png"/>
+            <wp:docPr id="17" name="image9.png"/>
             <a:graphic>
               <a:graphicData uri="http://schemas.openxmlformats.org/drawingml/2006/picture">
                 <pic:pic>
                   <pic:nvPicPr>
-                    <pic:cNvPr id="0" name="image10.png"/>
+                    <pic:cNvPr id="0" name="image9.png"/>
                     <pic:cNvPicPr preferRelativeResize="0"/>
                   </pic:nvPicPr>
                   <pic:blipFill>
-                    <a:blip r:embed="rId25"/>
+                    <a:blip r:embed="rId22"/>
                     <a:srcRect b="0" l="0" r="0" t="0"/>
                     <a:stretch>
                       <a:fillRect/>
@@ -17710,16 +17785,16 @@
           <wp:inline distB="114300" distT="114300" distL="114300" distR="114300">
             <wp:extent cx="6481763" cy="5484568"/>
             <wp:effectExtent b="0" l="0" r="0" t="0"/>
-            <wp:docPr id="21" name="image11.png"/>
+            <wp:docPr id="19" name="image7.png"/>
             <a:graphic>
               <a:graphicData uri="http://schemas.openxmlformats.org/drawingml/2006/picture">
                 <pic:pic>
                   <pic:nvPicPr>
-                    <pic:cNvPr id="0" name="image11.png"/>
+                    <pic:cNvPr id="0" name="image7.png"/>
                     <pic:cNvPicPr preferRelativeResize="0"/>
                   </pic:nvPicPr>
                   <pic:blipFill>
-                    <a:blip r:embed="rId26"/>
+                    <a:blip r:embed="rId23"/>
                     <a:srcRect b="0" l="0" r="0" t="0"/>
                     <a:stretch>
                       <a:fillRect/>
@@ -17966,16 +18041,16 @@
           <wp:inline distB="114300" distT="114300" distL="114300" distR="114300">
             <wp:extent cx="6024563" cy="4781927"/>
             <wp:effectExtent b="0" l="0" r="0" t="0"/>
-            <wp:docPr id="6" name="image2.png"/>
+            <wp:docPr id="6" name="image1.png"/>
             <a:graphic>
               <a:graphicData uri="http://schemas.openxmlformats.org/drawingml/2006/picture">
                 <pic:pic>
                   <pic:nvPicPr>
-                    <pic:cNvPr id="0" name="image2.png"/>
+                    <pic:cNvPr id="0" name="image1.png"/>
                     <pic:cNvPicPr preferRelativeResize="0"/>
                   </pic:nvPicPr>
                   <pic:blipFill>
-                    <a:blip r:embed="rId27"/>
+                    <a:blip r:embed="rId24"/>
                     <a:srcRect b="0" l="0" r="0" t="0"/>
                     <a:stretch>
                       <a:fillRect/>
@@ -18231,16 +18306,16 @@
           <wp:inline distB="114300" distT="114300" distL="114300" distR="114300">
             <wp:extent cx="6119813" cy="7797170"/>
             <wp:effectExtent b="0" l="0" r="0" t="0"/>
-            <wp:docPr id="16" name="image24.png"/>
+            <wp:docPr id="15" name="image21.png"/>
             <a:graphic>
               <a:graphicData uri="http://schemas.openxmlformats.org/drawingml/2006/picture">
                 <pic:pic>
                   <pic:nvPicPr>
-                    <pic:cNvPr id="0" name="image24.png"/>
+                    <pic:cNvPr id="0" name="image21.png"/>
                     <pic:cNvPicPr preferRelativeResize="0"/>
                   </pic:nvPicPr>
                   <pic:blipFill>
-                    <a:blip r:embed="rId28"/>
+                    <a:blip r:embed="rId25"/>
                     <a:srcRect b="3957" l="2362" r="2835" t="3856"/>
                     <a:stretch>
                       <a:fillRect/>
@@ -18304,18 +18379,18 @@
         </w:rPr>
         <w:drawing>
           <wp:inline distB="114300" distT="114300" distL="114300" distR="114300">
-            <wp:extent cx="6329363" cy="7877175"/>
+            <wp:extent cx="4110038" cy="7880001"/>
             <wp:effectExtent b="0" l="0" r="0" t="0"/>
-            <wp:docPr id="9" name="image23.png"/>
+            <wp:docPr id="8" name="image20.png"/>
             <a:graphic>
               <a:graphicData uri="http://schemas.openxmlformats.org/drawingml/2006/picture">
                 <pic:pic>
                   <pic:nvPicPr>
-                    <pic:cNvPr id="0" name="image23.png"/>
+                    <pic:cNvPr id="0" name="image20.png"/>
                     <pic:cNvPicPr preferRelativeResize="0"/>
                   </pic:nvPicPr>
                   <pic:blipFill>
-                    <a:blip r:embed="rId29"/>
+                    <a:blip r:embed="rId26"/>
                     <a:srcRect b="3103" l="0" r="0" t="3513"/>
                     <a:stretch>
                       <a:fillRect/>
@@ -18324,7 +18399,7 @@
                   <pic:spPr>
                     <a:xfrm>
                       <a:off x="0" y="0"/>
-                      <a:ext cx="6329363" cy="7877175"/>
+                      <a:ext cx="4110038" cy="7880001"/>
                     </a:xfrm>
                     <a:prstGeom prst="rect"/>
                     <a:ln/>
@@ -18342,8 +18417,8 @@
       </w:r>
     </w:p>
     <w:sectPr>
-      <w:headerReference r:id="rId30" w:type="default"/>
-      <w:footerReference r:id="rId31" w:type="default"/>
+      <w:headerReference r:id="rId27" w:type="default"/>
+      <w:footerReference r:id="rId28" w:type="default"/>
       <w:pgSz w:h="15840" w:w="12240" w:orient="portrait"/>
       <w:pgMar w:bottom="1440" w:top="1440" w:left="1440" w:right="1440" w:header="720" w:footer="720"/>
       <w:pgNumType w:start="1"/>

</xml_diff>